<commit_message>
General T&C v9: correzioni dello studio del 9/10 riportate chirurgicamente in EN DE ES FR PL PT RO RU CZ (solo i 35 paragrafi corretti), Word ricostruiti e verificati
Co-Authored-By: Claude Opus 5.5 (1M context) <noreply@anthropic.com>
</commit_message>
<xml_diff>
--- a/T&C/General T&C/Vers 9 - Multilanguage - Q4 2026/9_Termini_e_Condizioni_Generali_Fleequid_F0009_2026_CZ.docx
+++ b/T&C/General T&C/Vers 9 - Multilanguage - Q4 2026/9_Termini_e_Condizioni_Generali_Fleequid_F0009_2026_CZ.docx
@@ -1314,7 +1314,7 @@
                 <w:smallCaps/>
                 <w:noProof/>
               </w:rPr>
-              <w:t>Odložený prodej: zálohová platba a Vozidlo dočasně v užívání Prodávajícího.</w:t>
+              <w:t>Odložený prodej: Zálohová platba a Vozidlo dočasně v užívání Prodávajícího.</w:t>
             </w:r>
             <w:r>
               <w:rPr>
@@ -2025,7 +2025,7 @@
                 <w:noProof/>
                 <w:webHidden/>
               </w:rPr>
-              <w:t>82</w:t>
+              <w:t>83</w:t>
             </w:r>
             <w:r>
               <w:rPr>
@@ -2310,7 +2310,7 @@
                 <w:noProof/>
                 <w:webHidden/>
               </w:rPr>
-              <w:t>87</w:t>
+              <w:t>88</w:t>
             </w:r>
             <w:r>
               <w:rPr>
@@ -3497,7 +3497,7 @@
           <w:sz w:val="20"/>
           <w:szCs w:val="20"/>
         </w:rPr>
-        <w:t>, která je držitelem značky Fleequid®. Tento termín se může vztahovat i na jiné právnické osoby, které jsou se společností Adorea S.r.l. spojeny nebo které společnost Adorea S.r.l. pověřila nabízením Vozidel k prodeji, a to podle čl. 2.9. Společnost Fleequid provozuje Online tržiště a zpřístupňuje Služby; postavení, v němž vystupuje v jednotlivé transakci, závisí na příslušném Prodejním modelu a v rámci Komisního prodeje na zvoleném způsobu provedení, a to podle čl. 2.3–2.8, 3, 17 a 18. Postavení společnosti Fleequid ve vztahu k Vozidlům, která lze kvalifikovat jako VUŽ nebo jinak jako odpad, upravují čl. 16.13 a 18.8.</w:t>
+        <w:t>, která je držitelem značky Fleequid®. Tento termín se může vztahovat i na jiné právnické osoby, které jsou se společností Adorea S.r.l. spojeny nebo které společnost Adorea S.r.l. pověřila nákupem a prodejem Vozidel, a to podle čl. 2.9. Společnost Fleequid provozuje Online tržiště a zpřístupňuje Služby; postavení, v němž vystupuje v jednotlivé transakci, závisí na příslušném Prodejním modelu a v rámci Komisního prodeje na zvoleném způsobu provedení, a to podle čl. 2.3–2.8, 3, 17 a 18. Postavení společnosti Fleequid ve vztahu k Vozidlům, která lze kvalifikovat jako VUŽ nebo jinak jako odpad, upravují čl. 16.13 a 18.8.</w:t>
       </w:r>
     </w:p>
     <w:p>
@@ -5291,7 +5291,7 @@
           <w:sz w:val="20"/>
           <w:szCs w:val="20"/>
         </w:rPr>
-        <w:t>Jakýkoli odkaz v těchto VOP na „</w:t>
+        <w:t>Nestanoví-li jednotlivé ustanovení výslovně lhůtu v kalendářních dnech, je jakýkoli odkaz v těchto VOP na „</w:t>
       </w:r>
       <w:r>
         <w:rPr>
@@ -5310,7 +5310,7 @@
           <w:sz w:val="20"/>
           <w:szCs w:val="20"/>
         </w:rPr>
-        <w:t>“ je třeba chápat jako odkaz na pracovní dny, přičemž „</w:t>
+        <w:t>“ třeba chápat jako odkaz na pracovní dny, přičemž „</w:t>
       </w:r>
       <w:r>
         <w:rPr>
@@ -5621,7 +5621,7 @@
           <w:sz w:val="20"/>
           <w:szCs w:val="20"/>
         </w:rPr>
-        <w:t>V rámci Komisního prodeje se společnost Fleequid může podle vlastního, nepřezkoumatelného uvážení rozhodnout, že Další prodej neprovede a že nákup a prodej, jimiž byla pověřena, provede jako Čistý zprostředkovatel, přičemž umožní, aby převod Vozidla a příslušná fakturace proběhly přímo od Prodávajícího na Kupujícího. V takovém případě je kupní smlouva o Vozidle uzavřena přímo mezi Prodávajícím a Kupujícím; společnost Fleequid ji neuzavírá, a to ani vlastním jménem, ani jako smluvní strana, Vozidlo nekupuje, a to ani dočasně, nenabývá postavení prodávajícího, a to ani formálního, a cenu Vozidla platí Kupující přímo Prodávajícímu; společnost Fleequid si zachovává nárok na Provize, které jí dluží obě Strany, a na Poplatky podle těchto Všeobecných obchodních podmínek. Působení v postavení Čistého zprostředkovatele představuje vnitřní způsob provedení Komisního prodeje podle čl. 2.3, a nikoli samostatný Prodejní model. Právo volby podle tohoto odstavce se vykonává podle čl. 3.2, 3.5 a 17.1, přičemž je s ním předem umožněno se seznámit a je předem přijato podle čl. 3.2 písm. a).</w:t>
+        <w:t>V rámci Komisního prodeje se společnost Fleequid může podle vlastního, nepřezkoumatelného uvážení rozhodnout, že Další prodej neprovede a že nákup a prodej, jimiž byla pověřena, provede jako Čistý zprostředkovatel, přičemž umožní, aby převod Vozidla a příslušná fakturace proběhly přímo od Prodávajícího na Kupujícího. V takovém případě je kupní smlouva o Vozidle uzavřena přímo mezi Prodávajícím a Kupujícím; společnost Fleequid ji neuzavírá, a to ani vlastním jménem, ani jako smluvní strana, Vozidlo nekupuje, a to ani dočasně, nenabývá postavení prodávajícího, a to ani formálního, a cenu Vozidla platí Kupující přímo Prodávajícímu; společnost Fleequid si zachovává nárok na Provize, které jí dluží obě Strany, a na Poplatky podle těchto Všeobecných obchodních podmínek. Působení v postavení Čistého zprostředkovatele představuje vnitřní způsob provedení Komisního prodeje podle čl. 2.3, a nikoli samostatný Prodejní model. Právo volby podle tohoto odstavce se vykonává podle čl. 3.2, 3.5 a 17.1, přičemž je s ním předem umožněno se seznámit podle čl. 3.2 písm. a) a je přijato přistoupením k těmto VOP.</w:t>
       </w:r>
     </w:p>
     <w:p>
@@ -6188,7 +6188,7 @@
           <w:sz w:val="20"/>
           <w:szCs w:val="20"/>
         </w:rPr>
-        <w:t>Společnost Fleequid si vyhrazuje právo kdykoli jednostranně změnit Všeobecné obchodní podmínky a Sazebník Fleequid podle vlastního uvážení, a to i za účelem zavedení nových produktů nebo Služeb, přizpůsobení způsobů fungování Online tržiště nebo za účelem dodržení právních ustanovení, předpisů nebo rozhodnutí příslušných orgánů. Změny se Uživatelům oznamují jasným a srozumitelným způsobem nejméně 30 (třicet) dní před nabytím jejich účinnosti, ledaže je Uživatel před uplynutím této lhůty výslovně přijal. Společnost Fleequid uchovává archiv předchozích verzí Všeobecných obchodních podmínek a Sazebníku Fleequid, který je přístupný prostřednictvím zákaznické podpory. Změny mohou být oznámeny jedním nebo více následujícími způsoby: a) e-mailem na e-mailovou adresu spojenou s profilem Uživatele, obsahujícím shrnutí změn a odkaz na aktualizovaná znění; b) oznámením zobrazeným při dalším přihlášení Uživatele na Online tržiště; c) zveřejněním oznámení na domovské stránce webových stránek společnosti Fleequid s odkazem na aktualizovaná znění. Uživatel, který nehodlá změny přijmout, může závazek bez sankcí vypovědět do 30 (třiceti) dnů od oznámení a v každém případě od zveřejnění aktualizovaných Všeobecných obchodních podmínek na Online tržišti, a to písemným oznámením na e-mailovou adresu withdrawal@fleequid.com. Změny se použijí na Prodejní akce a transakce zahájené po nabytí jejich účinnosti; na Prodejní akce a transakce, které již probíhají, jakož i na ty, u nichž již byla uzavřena Závazná dohoda, se až do jejich ukončení nadále použijí Všeobecné obchodní podmínky a Sazebník Fleequid platné v okamžiku zahájení příslušné Prodejní akce nebo příslušné transakce, s výhradou čl. 4.9. Po obdržení výpovědi společnost Fleequid odstraní profil Uživatele podle čl. 5.11. Uživatelé jsou povinni před podáním Nabídky zkontrolovat platnou verzi Všeobecných obchodních podmínek a Sazebníku Fleequid v příslušné sekci Online tržiště. Po uplynutí oznamovací lhůty znamená pokračování v používání Online tržiště nebo Služeb společnosti Fleequid přijetí změn, které nabyly účinnosti. V případě sporu ohledně verze nebo uplatnitelnosti Všeobecných obchodních podmínek na Smlouvu musí Uživatelé prokázat, že přes veškeré přiměřené úsilí neměli možnost nahlédnout do platných Všeobecných obchodních podmínek, a to i přes vstup do příslušné sekce Online tržiště a včasnou písemnou žádost adresovanou společnosti Fleequid, a teprve poté mohou v tomto ohledu vznést jakoukoli námitku, nárok nebo reklamaci.</w:t>
+        <w:t>Společnost Fleequid si vyhrazuje právo kdykoli jednostranně změnit Všeobecné obchodní podmínky a Sazebník Fleequid podle vlastního uvážení, a to i za účelem zavedení nových produktů nebo Služeb, přizpůsobení způsobů fungování Online tržiště nebo za účelem dodržení právních ustanovení, předpisů nebo rozhodnutí příslušných orgánů. Změny se Uživatelům oznamují jasným a srozumitelným způsobem nejméně 30 (třicet) kalendářních dní před nabytím jejich účinnosti, ledaže je Uživatel před uplynutím této lhůty výslovně přijal. Společnost Fleequid uchovává archiv předchozích verzí Všeobecných obchodních podmínek a Sazebníku Fleequid, který je přístupný prostřednictvím zákaznické podpory. Změny mohou být oznámeny jedním nebo více následujícími způsoby: a) e-mailem na e-mailovou adresu spojenou s profilem Uživatele, obsahujícím shrnutí změn a odkaz na aktualizovaná znění; b) oznámením zobrazeným při dalším přihlášení Uživatele na Online tržiště; c) zveřejněním oznámení na domovské stránce webových stránek společnosti Fleequid s odkazem na aktualizovaná znění. Uživatel, který nehodlá změny přijmout, může závazek bez sankcí vypovědět do 30 (třiceti) kalendářních dnů od oznámení a v každém případě od zveřejnění aktualizovaných Všeobecných obchodních podmínek na Online tržišti, a to písemným oznámením na e-mailovou adresu withdrawal@fleequid.com. Změny se použijí na Prodejní akce a transakce zahájené po nabytí jejich účinnosti; na Prodejní akce a transakce, které již probíhají, jakož i na ty, u nichž již byla uzavřena Závazná dohoda, se až do jejich ukončení nadále použijí Všeobecné obchodní podmínky a Sazebník Fleequid platné v okamžiku zahájení příslušné Prodejní akce nebo příslušné transakce, s výhradou čl. 4.9. Po obdržení výpovědi společnost Fleequid odstraní profil Uživatele podle čl. 5.11. Uživatelé jsou povinni před podáním Nabídky zkontrolovat platnou verzi Všeobecných obchodních podmínek a Sazebníku Fleequid v příslušné sekci Online tržiště. Po uplynutí oznamovací lhůty znamená pokračování v používání Online tržiště nebo Služeb společnosti Fleequid přijetí změn, které nabyly účinnosti. V případě sporu ohledně verze nebo uplatnitelnosti Všeobecných obchodních podmínek na Smlouvu musí Uživatelé prokázat, že přes veškeré přiměřené úsilí neměli možnost nahlédnout do platných Všeobecných obchodních podmínek, a to i přes vstup do příslušné sekce Online tržiště a včasnou písemnou žádost adresovanou společnosti Fleequid, a teprve poté mohou v tomto ohledu vznést jakoukoli námitku, nárok nebo reklamaci.</w:t>
       </w:r>
     </w:p>
     <w:p>
@@ -6680,7 +6680,7 @@
           <w:sz w:val="20"/>
           <w:szCs w:val="20"/>
         </w:rPr>
-        <w:t>Společnost Fleequid neprodleně písemně informuje Uživatele o opatřeních přijatých podle čl. 5.5 výše a uvede jejich důvody. S ohledem na povahu a závažnost zjištěných okolností může společnost Fleequid okamžitě přijmout opatření nezbytná k ukončení nebo omezení vytýkaného stavu, anebo vyzvat Uživatele, aby zjednal nápravu ve lhůtě 30 (třiceti) dnů. Po marném uplynutí této lhůty může společnost Fleequid pozastavit nebo zablokovat, a to i na dobu neurčitou, profil Uživatele nebo omezit jeho přístup na Online tržiště a k příslušným Službám. Uvedená lhůta se nepoužije, pokud: a) společnost Fleequid musí splnit zákonnou či regulační povinnost nebo rozhodnutí příslušného orgánu, které vyžadují okamžité ukončení nebo omezení poskytování Vozidel nebo Služeb Uživateli; b) jsou splněny předpoklady pro okamžité odstoupení od Smlouvy podle zákona nebo těchto Všeobecných obchodních podmínek; c) Uživatel opakovaně porušil pravidla používání Online tržiště; d) údaje nebo obsah, které lze přičíst Uživateli, jsou nezákonné nebo nevhodné, anebo jeho jednání může ohrozit bezpečnost nebo řádné fungování Online tržiště, společnosti Fleequid nebo ostatních Uživatelů; e) jednání souvisí s podvody, paděláním, porušením předpisů v oblasti osobních údajů, spamem nebo jinými nezákonnými či zneužívajícími činnostmi. V těchto případech může společnost Fleequid přijmout opatření bez předchozí výzvy, přičemž Uživateli v každém případě sdělí jeho odůvodnění. Klasifikace Uživatele podle čl. 6 není opatřením ve smyslu tohoto odstavce a nevztahuje se na ni zde stanovený postup. Stejně tak omezení nebo pozastavení funkčnosti účtu, o němž bylo rozhodnuto vůči Kupujícímu, který je ve zpoždění nebo neplní své povinnosti, podle čl. 12.10 představuje samostatné opatření upravené uvedeným ustanovením, není pohlceno postupem stanoveným v tomto odstavci a není podmíněno jeho předpoklady a lhůtami.</w:t>
+        <w:t>Společnost Fleequid neprodleně písemně informuje Uživatele o opatřeních přijatých podle čl. 5.5 výše a uvede jejich důvody. S ohledem na povahu a závažnost zjištěných okolností může společnost Fleequid okamžitě přijmout opatření nezbytná k ukončení nebo omezení vytýkaného stavu, anebo vyzvat Uživatele, aby zjednal nápravu ve lhůtě 30 (třiceti) dnů. Po marném uplynutí této lhůty může společnost Fleequid pozastavit nebo zablokovat, a to i na dobu neurčitou, profil Uživatele nebo omezit jeho přístup na Online tržiště a k příslušným Službám. Uvedená lhůta se nepoužije, pokud: a) společnost Fleequid musí splnit zákonnou či regulační povinnost nebo rozhodnutí příslušného orgánu, které vyžadují okamžité ukončení nebo omezení poskytování Vozidel nebo Služeb Uživateli; b) jsou splněny předpoklady pro okamžité odstoupení od Smlouvy podle zákona nebo těchto Všeobecných obchodních podmínek; c) Uživatel opakovaně porušil pravidla používání Online tržiště; d) údaje nebo obsah, které lze přičíst Uživateli, jsou nezákonné nebo nevhodné, anebo jeho jednání může ohrozit bezpečnost nebo řádné fungování Online tržiště, společnosti Fleequid nebo ostatních Uživatelů; e) jednání souvisí s podvody, paděláním, porušením předpisů v oblasti osobních údajů, spamem nebo jinými nezákonnými či zneužívajícími činnostmi. V těchto případech může společnost Fleequid přijmout opatření bez předchozí výzvy, přičemž Uživateli v každém případě sdělí jeho odůvodnění. Klasifikace Uživatele podle čl. 6 není opatřením ve smyslu tohoto odstavce a nevztahuje se na ni zde stanovený postup. Stejně tak omezení nebo pozastavení funkčnosti profilu, o němž bylo rozhodnuto vůči Kupujícímu, který je ve zpoždění nebo neplní své povinnosti, podle čl. 12.10 představuje samostatné opatření upravené uvedeným ustanovením, není pohlceno postupem stanoveným v tomto odstavci a není podmíněno jeho předpoklady a lhůtami.</w:t>
       </w:r>
     </w:p>
     <w:p>
@@ -6780,7 +6780,7 @@
           <w:sz w:val="20"/>
           <w:szCs w:val="20"/>
         </w:rPr>
-        <w:t>. Tento systém je strukturován v souladu s článkem 11 nařízení (EU) 2019/1150, které společnost Fleequid uplatňuje i dobrovolně tam, kde není přímo použitelné. Podle čl. 12 výše uvedeného nařízení budou veškeré spory týkající se uplatnění ustanovení tohoto článku předloženy k pokusu o mediaci Mediační komoře při Obchodní komoře v Comu, o které společnost Fleequid prohlašuje, že je ochotna s ní spolupracovat za účelem pokusu o mediaci vedeného mediátorem, fyzickou osobou jmenovanou a působící v souladu s ustanoveními mediačního řádu této Obchodní komory, do něhož může Uživatel nahlédnout v příslušné sekci jejích oficiálních internetových stránek. Tím není dotčena úprava reklamačního postupu týkajícího se Vozidel podle čl. 20.</w:t>
+        <w:t>. Tento systém je strukturován v souladu s článkem 11 nařízení (EU) 2019/1150, které společnost Fleequid uplatňuje i dobrovolně tam, kde není přímo použitelné. Podle čl. 12 výše uvedeného nařízení budou spory týkající se přístupu na Online tržiště, jeho používání a opatření spočívajících v omezení, pozastavení nebo ukončení přístupu nebo činnosti Uživatele přijatých společností Fleequid podle tohoto článku předloženy k pokusu o mediaci Mediační komoře při Obchodní komoře v Comu, o které společnost Fleequid prohlašuje, že je ochotna s ní spolupracovat za účelem pokusu o mediaci vedeného mediátorem, fyzickou osobou jmenovanou a působící v souladu s ustanoveními mediačního řádu této Obchodní komory, do něhož může Uživatel nahlédnout v příslušné sekci jejích oficiálních internetových stránek. Nedotčena a samostatná zůstává úprava reklamačního postupu týkajícího se Vozidel podle čl. 20, na kterou se pokus o mediaci podle tohoto odstavce nepoužije, ledaže se spor týká rovněž, a to samostatně, některé ze záležitostí uvedených v předchozí větě.</w:t>
       </w:r>
     </w:p>
     <w:p>
@@ -6952,7 +6952,7 @@
           <w:sz w:val="20"/>
           <w:szCs w:val="20"/>
         </w:rPr>
-        <w:t>Výši Kauce určuje společnost Fleequid v závislosti na Prodejní akci, vlastnostech a ekonomické hodnotě Vozidla, riziku spojeném s konkrétní transakcí a případně na Klasifikaci Uživatele. Tyto Všeobecné obchodní podmínky nestanoví pevnou a jednotnou standardní částku. Aniž jsou dotčeny běžně uplatňované podmínky a případné zvýhodněné podmínky nebo výjimky přiznané společností Fleequid, může Klasifikace Uživatele vést k uplatnění rozdílných kaučních režimů, členěných podle typu Vozidla a typu Prodejní akce a zpravidla strukturovaných takto: (i) kauční režim první úrovně: 2.000,00 EUR u Vozidel určených k sešrotování; 1.000,00 EUR u 1 Euro Auctions; 1.000,00 EUR u Vozidel s Rezervační cenou do 50.000,00 EUR; 2.000,00 EUR u Vozidel s Rezervační cenou vyšší než 50.000,00 EUR; (ii) kauční režim druhé úrovně: 2.000,00 EUR u jakékoli Prodejní akce. Uplatnění některého z uvedených režimů nebo jiné částky určené podle věty první nevyžaduje, aby byla Uživateli přidělena nebo sdělena určitá kvalifikace nebo označení, přičemž tím není dotčen čl. 6.1 ohledně předchozí seznatelnosti povinnosti složit Kauci a její výše, která má v každém případě přednost před běžně uplatňovanými hodnotami.</w:t>
+        <w:t>Výši Kauce určuje společnost Fleequid v závislosti na Prodejní akci, vlastnostech a ekonomické hodnotě Vozidla, riziku spojeném s konkrétní transakcí a případně na Klasifikaci Uživatele. Tyto Všeobecné obchodní podmínky nestanoví pevnou a jednotnou standardní částku. Aniž jsou dotčeny běžně uplatňované podmínky a případné zvýhodněné podmínky nebo výjimky přiznané společností Fleequid, může Klasifikace Uživatele vést k uplatnění rozdílných kaučních režimů, členěných podle typu Vozidla a typu Prodejní akce a zpravidla strukturovaných takto: (i) kauční režim první úrovně: 2.000,00 EUR u Vozidel určených k sešrotování; 1.000,00 EUR u 1 Euro Auctions; 1.000,00 EUR u Vozidel s Rezervační cenou do 50.000,00 EUR; 2.000,00 EUR u Vozidel s Rezervační cenou vyšší než 50.000,00 EUR; (ii) kauční režim druhé úrovně: 2.000,00 EUR u jakékoli Prodejní akce. Uplatnění některého z uvedených režimů nebo jiné částky určené podle věty první nevyžaduje, aby byla Uživateli přidělena nebo sdělena určitá kvalifikace nebo označení, přičemž tím není dotčen čl. 6.1 ohledně předchozí seznatelnosti povinnosti složit Kauci a její výše; povinnost a výše, s nimiž bylo Nabízejícímu konkrétně umožněno seznámit se podle čl. 6.1, mají v každém případě přednost před běžně uplatňovanými hodnotami.</w:t>
       </w:r>
     </w:p>
     <w:p>
@@ -7129,7 +7129,7 @@
           <w:sz w:val="20"/>
           <w:szCs w:val="20"/>
         </w:rPr>
-        <w:t xml:space="preserve">Při registraci na Online tržišti společnosti Fleequid registrovaný Uživatel prohlašuje, že se seznámil se Zásadami ochrany osobních údajů v souladu s platnými zákony a požadavky článku 13 GDPR – nařízení (EU) 2016/679, jež jsou k dispozici na následující adrese: </w:t>
+        <w:t xml:space="preserve">Při registraci na Online tržišti společnosti Fleequid registrovaný Uživatel prohlašuje, že se seznámil se Zásadami ochrany osobních údajů, jež jsou k dispozici na následující adrese: </w:t>
       </w:r>
       <w:hyperlink r:id="rId16" w:history="1">
         <w:r>
@@ -7142,7 +7142,7 @@
           <w:sz w:val="20"/>
           <w:szCs w:val="20"/>
         </w:rPr>
-        <w:t>. Osobní údaje jsou zpracovávány v souladu se všemi bezpečnostními opatřeními, která zaručují jejich bezpečnost a důvěrnost, v souladu s ustanoveními GDPR pro účely uvedené v těchto Zásadách ochrany osobních údajů, jež rovněž uvádějí a objasňují práva a postupy, které může subjekt údajů uplatnit ve vztahu ke svým osobním údajům.</w:t>
+        <w:t>, v souladu s platnými zákony a požadavky článku 13 GDPR – nařízení (EU) 2016/679. Osobní údaje jsou zpracovávány v souladu se všemi bezpečnostními opatřeními, která zaručují jejich bezpečnost a důvěrnost, v souladu s ustanoveními GDPR pro účely uvedené v těchto Zásadách ochrany osobních údajů, jež rovněž uvádějí a objasňují práva a postupy, které může subjekt údajů uplatnit ve vztahu ke svým osobním údajům.</w:t>
       </w:r>
     </w:p>
     <w:p>
@@ -7516,7 +7516,7 @@
           <w:sz w:val="20"/>
           <w:szCs w:val="20"/>
         </w:rPr>
-        <w:t>Po zániku závazku k nabízení k prodeji převzatého podle čl. 8.8 může Prodávající, nebylo-li Vozidlo prodáno, přistoupit samostatně k jeho prodeji prostřednictvím jakéhokoli jiného kanálu, bez omezení minimální ceny a vůči jakékoli osobě, aniž jsou dotčeny povinnosti k převodu Vozidla, které případně již vznikly nebo dosud trvají v souvislosti s konkrétní transakcí, a zejména v rámci Dealer Sales. Nedotčena zůstává povinnost Prodávajícího nepoužívat informace, kontakty nebo obchodní příležitosti získané prostřednictvím Online tržiště nebo prostřednictvím společnosti Fleequid k tomu, aby přímo či nepřímo uzavíral transakce směřující k obcházení účasti společnosti Fleequid. Tato povinnost trvá po dobu 24 (dvaceti čtyř) měsíců od prvního zveřejnění Inzerátu týkajícího se Vozidla na Online tržišti nebo, nepředpokládá-li se zveřejnění Inzerátu, od první činnosti směřující k nabízení Vozidla k prodeji provedené společností Fleequid. V případě porušení má společnost Fleequid právo uplatnit vůči Prodávajícímu smluvní pokutu určenou podle kritéria stanoveného v čl. 8.9. Pokud Prodávající v době, kdy je podle příslušného Prodejního modelu a těchto Všeobecných obchodních podmínek povinen Vozidlo převést, bez oprávněného důvodu odmítne převést vlastnictví k němu: a) na společnost Fleequid v rámci Komisního prodeje provedeného formou Dalšího prodeje, je Prodávající povinen zaplatit smluvní pokutu ve výši 30 % Prodejní ceny pro Kupujícího; b) na společnost Fleequid v rámci Dealer Sales, je Prodávající povinen zaplatit smluvní pokutu ve výši 30 % Nákupní ceny, kterou společnost Fleequid dluží Prodávajícímu; c) přímo na Kupujícího v případech, kdy společnost Fleequid působí jako Čistý zprostředkovatel podle čl. 2.6, je Prodávající povinen zaplatit společnosti Fleequid smluvní pokutu ve výši 30 % Prodejní ceny pro Kupujícího. Pro účely tohoto odstavce se má za to, že k odmítnutí došlo, vyplývá-li z prohlášení Prodávajícího nebo z jeho jednání jednoznačně neslučitelného se splněním povinnosti, anebo, není-li tomu tak, nesplní-li Prodávající konkrétní povinnost do 10 (deseti) dnů od písemné výzvy, kterou jej společnost Fleequid vyzvala k jejímu splnění. Nedotčeno zůstává právo společnosti Fleequid na náhradu případné další škody, jakož i, v případech, kdy je Kupní smlouva uzavřena přímo mezi Prodávajícím a Kupujícím, veškerá práva a prostředky nápravy náležející Kupujícímu. V rámci Dealer Sales zahrnuje další škoda, která se společnosti Fleequid nahrazuje, rovněž částky, které je společnost Fleequid povinna zaplatit svému Kupujícímu v důsledku porušení povinnosti Prodávajícím, jakož i související náhrady, smluvní pokuty, náklady a výdaje. Nedotčeny zůstávají rovněž další prostředky nápravy stanovené těmito Všeobecnými obchodními podmínkami, včetně těch podle čl. 16.9 a 17.8 a, působí-li společnost Fleequid jako Čistý zprostředkovatel, podle čl. 17.14, aniž je dotčena koordinace příslušných smluvních pokut podle čl. 15.8. Zejména platí, že pokud prodej Vozidla třetí osobě nebo jiné rovnocenné jednání, k němuž dojde během Opčního stavu, naplňuje současně porušení exkluzivity podle čl. 8.9, odmítnutí převést vlastnictví upravené tímto odstavcem nebo neposkytnutí Vozidla k dispozici či jeho nedodání podle čl. 16.9, příslušné smluvní pokuty se nekumulují, vyplývají-li z téhož skutku a chrání-li tentýž zájem: uplatní se výlučně jediná smluvní pokuta, určená podle kritéria uvedeného v čl. 15.8 v tomto pořadí: (i) smluvní pokuta stanovená tímto odstavcem, naplňuje-li jednání odmítnutí převést vlastnictví podle výše uvedených kritérií; (ii) nedojde-li k odmítnutí, smluvní pokuty stanovené v čl. 16.9, vede-li jednání k neposkytnutí Vozidla k dispozici nebo k jeho nedodání, po němž následuje Zrušení prodeje; (iii) v ostatních případech smluvní pokuta stanovená v čl. 8.9 za porušení exkluzivity; nedotčeny zůstávají následky, které nemají povahu smluvní pokuty, a následky vyplývající ze skutkově odlišných okolností.</w:t>
+        <w:t>Po zániku závazku k nabízení k prodeji převzatého podle čl. 8.8 může Prodávající, nebylo-li Vozidlo prodáno, přistoupit samostatně k jeho prodeji prostřednictvím jakéhokoli jiného kanálu, bez omezení minimální ceny a vůči jakékoli osobě, aniž jsou dotčeny povinnosti k převodu Vozidla, které případně již vznikly nebo dosud trvají v souvislosti s konkrétní transakcí, a zejména v rámci Dealer Sales. Nedotčena zůstává povinnost Prodávajícího nepoužívat informace, kontakty nebo obchodní příležitosti získané prostřednictvím Online tržiště nebo prostřednictvím společnosti Fleequid k tomu, aby přímo či nepřímo uzavíral transakce směřující k obcházení účasti společnosti Fleequid. Tato povinnost trvá po dobu 24 (dvaceti čtyř) měsíců od prvního zveřejnění Inzerátu týkajícího se Vozidla na Online tržišti nebo, nepředpokládá-li se zveřejnění Inzerátu, od první činnosti směřující k nabízení Vozidla k prodeji provedené společností Fleequid. V případě porušení má společnost Fleequid právo uplatnit vůči Prodávajícímu smluvní pokutu určenou podle kritéria stanoveného v čl. 8.9. Pokud Prodávající v době, kdy je podle příslušného Prodejního modelu a těchto Všeobecných obchodních podmínek povinen Vozidlo převést, bez oprávněného důvodu odmítne převést vlastnictví k němu: a) na společnost Fleequid v rámci Komisního prodeje provedeného formou Dalšího prodeje, je Prodávající povinen zaplatit jí smluvní pokutu ve výši 30 % Prodejní ceny pro Kupujícího; b) na společnost Fleequid v rámci Dealer Sales, je Prodávající povinen zaplatit jí smluvní pokutu ve výši 30 % Nákupní ceny, kterou společnost Fleequid dluží Prodávajícímu; c) přímo na Kupujícího v případech, kdy společnost Fleequid působí jako Čistý zprostředkovatel podle čl. 2.6, je Prodávající povinen zaplatit společnosti Fleequid smluvní pokutu ve výši 30 % Prodejní ceny pro Kupujícího. Pro účely tohoto odstavce se má za to, že k odmítnutí došlo, vyplývá-li z prohlášení Prodávajícího nebo z jeho jednání jednoznačně neslučitelného se splněním povinnosti, anebo, není-li tomu tak, nesplní-li Prodávající konkrétní povinnost do 10 (deseti) dnů od písemné výzvy, kterou jej společnost Fleequid vyzvala k jejímu splnění. Nedotčeno zůstává právo společnosti Fleequid na náhradu případné další škody, jakož i, v případech, kdy je Kupní smlouva uzavřena přímo mezi Prodávajícím a Kupujícím, veškerá práva a prostředky nápravy náležející Kupujícímu. V rámci Dealer Sales zahrnuje další škoda, která se společnosti Fleequid nahrazuje, rovněž částky, které je společnost Fleequid povinna zaplatit svému Kupujícímu v důsledku porušení povinnosti Prodávajícím, jakož i související náhrady, smluvní pokuty, náklady a výdaje. Nedotčeny zůstávají rovněž další prostředky nápravy stanovené těmito Všeobecnými obchodními podmínkami, včetně těch podle čl. 16.9 a 17.8 a, působí-li společnost Fleequid jako Čistý zprostředkovatel, podle čl. 17.14, aniž je dotčena koordinace příslušných smluvních pokut podle čl. 15.8. Zejména platí, že pokud prodej Vozidla třetí osobě nebo jiné rovnocenné jednání, k němuž dojde během Opčního stavu, naplňuje současně porušení exkluzivity podle čl. 8.9, odmítnutí převést vlastnictví upravené tímto odstavcem nebo neposkytnutí Vozidla k dispozici či jeho nedodání podle čl. 16.9, příslušné smluvní pokuty se nekumulují, vyplývají-li z téhož skutku a chrání-li tentýž zájem: uplatní se výlučně jediná smluvní pokuta, určená podle kritéria uvedeného v čl. 15.8 v tomto pořadí: (i) smluvní pokuta stanovená tímto odstavcem, naplňuje-li jednání odmítnutí převést vlastnictví podle výše uvedených kritérií; (ii) nedojde-li k odmítnutí, smluvní pokuty stanovené v čl. 16.9, vede-li jednání k neposkytnutí Vozidla k dispozici nebo k jeho nedodání, po němž následuje Zrušení prodeje; (iii) v ostatních případech smluvní pokuta stanovená v čl. 8.9 za porušení exkluzivity; nedotčeny zůstávají následky, které nemají povahu smluvní pokuty, a následky vyplývající ze skutkově odlišných okolností.</w:t>
       </w:r>
     </w:p>
     <w:p>
@@ -7566,7 +7566,7 @@
           <w:sz w:val="20"/>
           <w:szCs w:val="20"/>
         </w:rPr>
-        <w:t>Prodávající se zavazuje odškodnit společnost Fleequid, společnosti jí ovládané, s ní propojené nebo přidružené, jakož i jejich členy statutárních orgánů, společníky, zaměstnance, spolupracovníky, zmocněnce a zástupce a zprostit je odpovědnosti ve vztahu k jakémukoli uplatněnému právu, nároku, žalobě, řízení, sporu, škodě, nákladu, výdaji nebo zátěži jakékoli povahy vyplývajícím z: a) nepravdivosti, opomenutí, nepřesností nebo porušení týkajících se prohlášení, záruk a závazků převzatých Prodávajícím podle těchto Všeobecných obchodních podmínek, včetně, příkladmo a nikoli vyčerpávajícím způsobem, opomenutí nebo nepřesností v Technických specifikacích nebo v informacích o stavu, vlastnostech a fungování Vozidla, jako je přítomnost neuvedené koroze, nesprávná funkce klimatizace, chybějící díly nebo příslušenství, rozsvícené kontrolky poruchy nebo výstražné kontrolky a obdobné případy; b) přítomnosti nebezpečných materiálů spojených s Vozidlem nebo kontaminace vyplývající z úniků, výronů, poruch nebo vad funkce; c) nepředložení, neúplného nebo opožděného předložení dokumentace, a to i v originále, nezbytné pro převod, přepis, dodání nebo provoz Vozidla; d) Břemen váznoucích na Vozidle, která nebyla Prodávajícím výslovně uvedena a v rámci konkrétní transakce akceptována; e) částek zaplacených nebo nákladů vynaložených společností Fleequid v souvislosti s výdaji, přednostními právy, právy, omezeními nebo nároky, zapsanými či nezapsanými, uplatňovanými věřiteli, orgány nebo jinými osobami k Vozidlu nebo v souvislosti s ním, za účelem umožnění jeho volné právní převoditelnosti nebo převodu; f) nedodržení příslušných právních předpisů, a to i v oblasti životního prostředí, včetně jakékoli odpovědnosti spojené s kvalifikací, držbou, správou, přepravou, využitím nebo odstraněním Vozidel určených k sešrotování nebo kvalifikovatelných jako VUŽ, jakož i s neoznámením, neúplným nebo opožděným oznámením příslušného určení nebo kvalifikace společnosti Fleequid; g) nesprávného nebo nevyhovujícího používání Online tržiště Prodávajícím; h) daní, poplatků, nákladů, výdajů nebo jiných zátěží vyplývajících z toho, že Prodávající nedodržel zákony, předpisy nebo povinnosti, které se na něj vztahují v souvislosti s Vozidlem nebo transakcí; i) jakéhokoli jiného nedbalostního, úmyslného nebo jinak protiprávního jednání Prodávajícího v souvislosti s těmito Všeobecnými obchodními podmínkami, Smlouvami nebo konkrétní transakcí. Příklady uvedené pod písm. a) mají pouze demonstrativní povahu a nijak neomezují obecný rozsah závazku k odškodnění a zproštění odpovědnosti. Tento závazek k odškodnění a zproštění odpovědnosti se v rámci Dealer Sales výslovně vztahuje na nároky uplatněné Kupujícím vůči společnosti Fleequid jako skutečnému prodávajícímu a na veškeré částky, náhrady, náklady, výdaje na opravu, zátěže a škody, které je společnost Fleequid povinna zaplatit nebo nést vůči svému Kupujícímu z důvodu skutečností, vad, závad, opomenutí nebo porušení povinností přičitatelných Prodávajícímu; v takových případech má společnost Fleequid vůči Prodávajícímu právo na regres a na plnou náhradu toho, co zaplatila nebo vynaložila. Prodávající zůstává odpovědný za správnost, úplnost a pravdivost Návrhu prodeje, Technických specifikací, případné technické dokumentace, Inzerátu a dokumentace týkající se Vozidla, a to i tehdy, byl-li tento obsah vypracován nebo doplněn s podporou společnosti Fleequid, a i tehdy, bylo-li Vozidlo předmětem TrustReportu nebo prohlídek provedených společností Fleequid nebo osobami jí pověřenými. Prodávající je povinen ověřit zpřístupněné informace a včas upozornit společnost Fleequid na jakoukoli nepřesnost, jakož i před převodem Vozidla oznámit jakoukoli vadu, závadu, nehodu, úpravu, poruchu nebo anomálii, o nichž ví. S výjimkou případu úmyslu nebo hrubé nedbalosti společnosti Fleequid neodpovídá společnost Fleequid za následky vyplývající z nepřesností, neúplnosti nebo nesrovnalostí informací týkajících se Vozidla přičitatelných Prodávajícímu ani za zpoždění při aktualizaci Návrhu prodeje, Inzerátu, technické dokumentace nebo jiných informací zpřístupněných Uživatelům, pokud jsou tato zpoždění způsobena okolnostmi nepřičitatelnými společnosti Fleequid. Společnost Fleequid dále nezaručuje výnosy, kterých bude možné dosáhnout nabízením Vozidla k prodeji nebo jeho prodejem.</w:t>
+        <w:t>Prodávající se zavazuje odškodnit společnost Fleequid, společnosti jí ovládané, s ní propojené nebo přidružené, jakož i jejich členy statutárních orgánů, společníky, zaměstnance, spolupracovníky, zmocněnce a zástupce a zprostit je odpovědnosti ve vztahu k jakémukoli uplatněnému právu, nároku, žalobě, řízení, sporu, škodě, nákladu, výdaji nebo zátěži jakékoli povahy vyplývajícím z: a) nepravdivosti, opomenutí, nepřesností nebo porušení týkajících se prohlášení, záruk a závazků převzatých Prodávajícím podle těchto Všeobecných obchodních podmínek, včetně, příkladmo a nikoli vyčerpávajícím způsobem, opomenutí nebo nepřesností v Technických specifikacích nebo v informacích o stavu, vlastnostech a fungování Vozidla, jako je přítomnost neuvedené koroze, nesprávná funkce klimatizace, chybějící díly nebo příslušenství, rozsvícené kontrolky poruchy nebo výstražné kontrolky a obdobné případy; b) přítomnosti nebezpečných materiálů spojených s Vozidlem nebo kontaminace vyplývající z úniků, výronů, poruch nebo vad funkce; c) nepředložení, neúplného nebo opožděného předložení dokumentace, a to i v originále, nezbytné pro převod, přepis, dodání nebo provoz Vozidla; d) Břemen váznoucích na Vozidle jiných než ta, která byla Prodávajícím výslovně uvedena a v rámci konkrétní transakce akceptována; e) částek zaplacených nebo nákladů vynaložených společností Fleequid v souvislosti s výdaji, přednostními právy, právy, omezeními nebo nároky, zapsanými či nezapsanými, uplatňovanými věřiteli, orgány nebo jinými osobami k Vozidlu nebo v souvislosti s ním, za účelem umožnění jeho volné právní převoditelnosti nebo převodu; f) nedodržení příslušných právních předpisů, a to i v oblasti životního prostředí, včetně jakékoli odpovědnosti spojené s kvalifikací, držbou, správou, přepravou, využitím nebo odstraněním Vozidel určených k sešrotování nebo kvalifikovatelných jako VUŽ, jakož i s neoznámením, neúplným nebo opožděným oznámením příslušného určení nebo kvalifikace společnosti Fleequid; g) nesprávného nebo nevyhovujícího používání Online tržiště Prodávajícím; h) daní, poplatků, nákladů, výdajů nebo jiných zátěží vyplývajících z toho, že Prodávající nedodržel zákony, předpisy nebo povinnosti, které se na něj vztahují v souvislosti s Vozidlem nebo transakcí; i) jakéhokoli jiného nedbalostního, úmyslného nebo jinak protiprávního jednání Prodávajícího v souvislosti s těmito Všeobecnými obchodními podmínkami, Smlouvami nebo konkrétní transakcí. Příklady uvedené pod písm. a) mají pouze demonstrativní povahu a nijak neomezují obecný rozsah závazku k odškodnění a zproštění odpovědnosti. Tento závazek k odškodnění a zproštění odpovědnosti se v rámci Dealer Sales výslovně vztahuje na nároky uplatněné Kupujícím vůči společnosti Fleequid jako skutečnému prodávajícímu a na veškeré částky, náhrady, náklady, výdaje na opravu, zátěže a škody, které je společnost Fleequid povinna zaplatit nebo nést vůči svému Kupujícímu z důvodu skutečností, vad, závad, opomenutí nebo porušení povinností přičitatelných Prodávajícímu; v takových případech má společnost Fleequid vůči Prodávajícímu právo na regres a na plnou náhradu toho, co zaplatila nebo vynaložila. Prodávající zůstává odpovědný za správnost, úplnost a pravdivost Návrhu prodeje, Technických specifikací, případné technické dokumentace, Inzerátu a dokumentace týkající se Vozidla, a to i tehdy, byl-li tento obsah vypracován nebo doplněn s podporou společnosti Fleequid, a i tehdy, bylo-li Vozidlo předmětem TrustReportu nebo prohlídek provedených společností Fleequid nebo osobami jí pověřenými. Prodávající je povinen ověřit zpřístupněné informace a včas upozornit společnost Fleequid na jakoukoli nepřesnost, jakož i před převodem Vozidla oznámit jakoukoli vadu, závadu, nehodu, úpravu, poruchu nebo anomálii, o nichž ví. S výjimkou případu úmyslu nebo hrubé nedbalosti společnosti Fleequid neodpovídá společnost Fleequid za následky vyplývající z nepřesností, neúplnosti nebo nesrovnalostí informací týkajících se Vozidla přičitatelných Prodávajícímu ani za zpoždění při aktualizaci Návrhu prodeje, Inzerátu, technické dokumentace nebo jiných informací zpřístupněných Uživatelům, pokud jsou tato zpoždění způsobena okolnostmi nepřičitatelnými společnosti Fleequid. Společnost Fleequid dále nezaručuje výnosy, kterých bude možné dosáhnout nabízením Vozidla k prodeji nebo jeho prodejem.</w:t>
       </w:r>
     </w:p>
     <w:p>
@@ -8713,7 +8713,7 @@
           <w:sz w:val="20"/>
           <w:szCs w:val="20"/>
         </w:rPr>
-        <w:t>Nestanoví-li následující odstavce jinak, činí Lhůta splatnosti 3 (tři) pracovní dny ode dne, kdy byla Kupujícímu zpřístupněna Proforma podle čl. 11.4. Lhůta splatnosti běží výlučně od tohoto okamžiku a za podmínky, že Proforma obsahuje údaje nezbytné k tomu, aby Kupující mohl platbu provést. Působí-li společnost Fleequid jako Čistý zprostředkovatel, použije se tatáž Lhůta splatnosti jak na zaplacení ceny dlužné Prodávajícímu, tak na zaplacení Provizí, Poplatků a případných dalších částek dlužných společnosti Fleequid.</w:t>
+        <w:t>Nestanoví-li následující odstavce jinak, činí Lhůta splatnosti 3 (tři) dny ode dne, kdy byla Kupujícímu zpřístupněna Proforma podle čl. 11.4. Lhůta splatnosti běží výlučně od tohoto okamžiku a za podmínky, že Proforma obsahuje údaje nezbytné k tomu, aby Kupující mohl platbu provést. Působí-li společnost Fleequid jako Čistý zprostředkovatel, použije se tatáž Lhůta splatnosti jak na zaplacení ceny dlužné Prodávajícímu, tak na zaplacení Provizí, Poplatků a případných dalších částek dlužných společnosti Fleequid.</w:t>
       </w:r>
     </w:p>
     <w:p>
@@ -8984,7 +8984,7 @@
           <w:sz w:val="20"/>
           <w:szCs w:val="20"/>
         </w:rPr>
-        <w:t>Provede-li Kupující platbu více úhradami, které společnost Fleequid předem nepovolila, avšak Celkovou dlužnou částku zcela doplatí ve Lhůtě splatnosti, je povinen zaplatit společnosti Fleequid smluvní pokutu ve výši 150,00 EUR (sto padesát/00 eur) za každé dotčené Vozidlo, aniž by tím bylo dotčeno právo na náhradu další škody. Porušení stanovené tímto odstavcem je samostatné a odlišné od zpoždění s platbou; příslušná smluvní pokuta se nezahrnuje do složky smluvních pokut rozhodné pro účely minimální hranice podle čl. 12.9 věta poslední.</w:t>
+        <w:t>Provede-li Kupující platbu více úhradami, které společnost Fleequid předem nepovolila, avšak Celkovou dlužnou částku zcela doplatí ve Lhůtě splatnosti, je povinen zaplatit společnosti Fleequid smluvní pokutu ve výši 150,00 EUR (sto padesát/00 eur) za každé dotčené Vozidlo, aniž by tím bylo dotčeno právo na náhradu další škody. Porušení stanovené tímto odstavcem je samostatné a odlišné od zpoždění s platbou; příslušná smluvní pokuta se nezahrnuje do složky smluvních pokut rozhodné pro účely minimální hranice podle čl. 12.9.</w:t>
       </w:r>
     </w:p>
     <w:p>
@@ -9084,7 +9084,7 @@
           <w:sz w:val="20"/>
           <w:szCs w:val="20"/>
         </w:rPr>
-        <w:t>V případě Zrušení prodeje z důvodu zpoždění nebo nezaplacení v plné výši přičitatelného Kupujícímu zůstávají společnosti Fleequid s konečnou platností dlužné: a) Provize k tíži Kupujícího, jsou-li pro konkrétní transakci stanoveny, a to podle čl. 12.4; b) denní smluvní pokuta podle čl. 12.6 písm. a) naběhlá do dne účinnosti Zrušení prodeje, jakož i naběhlé úroky z prodlení; c) v rámci Komisního prodeje, ať už společnost Fleequid postupuje formou Dalšího prodeje, nebo působí jako Čistý zprostředkovatel, další smluvní pokuta ve výši dvojnásobku Provizí k tíži Kupujícího, určená na základě Provizí použitelných na konkrétní transakci, takže částka celkově dlužná z titulu Provizí a této smluvní pokuty se rovná trojnásobku částky Provizí; d) další smluvní pokuta ve výši 1.000,00 EUR (jeden tisíc/00 eur) za každé Vozidlo dotčené Závaznou dohodou, která byla následně zrušena; e) Poplatky za již poskytnuté Služby a jakákoli další částka vzniklá ze samostatného právního důvodu podle těchto Všeobecných obchodních podmínek. V rámci Dealer Sales, jelikož Kupující Provize podle Komisního prodeje nedluží, se smluvní pokuta podle písm. c) nepoužije; dlužné naproti tomu zůstávají částky podle písm. b), d) a e). Jsou-li splněny předpoklady stanovené v čl. 13, zůstává dále nedotčena přeměna Zálohové platby ve smluvní pokutu podle čl. 13.6. Částky stanovené tímto odstavcem jsou dlužné z odlišných právních důvodů a lze je kumulovat v mezích povolených zákonem. Případně složená Kauce představuje výlučně zajištění závazků Kupujícího a lze ji započíst na dlužné částky podle čl. 6.3, aniž by představovala další právní titul k účtování částek. Nedotčeno zůstává právo společnosti Fleequid na náhradu další škody, a to pouze v části přesahující to, co již bylo uspokojeno smluvními pokutami stanovenými těmito Všeobecnými obchodními podmínkami. Je-li součet smluvních pokut podle písm. b), pouze pokud jde o denní smluvní pokutu, c) a d), jakož i, připadá-li to v úvahu, smluvní pokuty vyplývající z přeměny Zálohové platby podle čl. 13.6 nižší než 5 % Prodejní ceny pro Kupujícího u Vozidla, které je předmětem zrušeného prodeje, doplní se celkově dlužná složka smluvních pokut výlučně do dosažení této hranice, která působí jako ekonomická spodní mez, a nikoli jako další kumulativní sankce. Pro účely srovnání a doplnění podle předchozí věty: (i) základem výpočtu je výlučně Prodejní cena pro Kupujícího u Vozidla, které je předmětem zrušeného prodeje, s vyloučením Celkové dlužné částky, Provizí, Poplatků a jakékoli jiné vedlejší částky; (ii) rozhodné jsou výlučně výše uvedené smluvní pokuty vlastní porušení povinnosti Kupujícím; (iii) nepřihlíží se k Provizím k tíži Kupujícího, Poplatkům, úrokům z prodlení, zadržené nebo započtené Kauci, náhradám nákladů a výdajů ani k náhradě další škody. Toto ustanovení se použije na všechny Prodejní modely; v rámci Dealer Sales se srovnání provádí pouze se smluvními pokutami tam použitelnými, aniž by smluvní pokuta podle písm. c) mohla být zavedena nebo započítána.</w:t>
+        <w:t>V případě Zrušení prodeje z důvodu zpoždění nebo nezaplacení v plné výši přičitatelného Kupujícímu zůstávají společnosti Fleequid s konečnou platností dlužné: a) Provize k tíži Kupujícího, jsou-li pro konkrétní transakci stanoveny, a to podle čl. 12.4; b) denní smluvní pokuta podle čl. 12.6 písm. a) naběhlá do dne účinnosti Zrušení prodeje, jakož i naběhlé úroky z prodlení; c) v rámci Komisního prodeje, ať už společnost Fleequid postupuje formou Dalšího prodeje, nebo působí jako Čistý zprostředkovatel, další smluvní pokuta ve výši dvojnásobku Provizí k tíži Kupujícího, určená na základě Provizí použitelných na konkrétní transakci, takže částka celkově dlužná z titulu Provizí a této smluvní pokuty se rovná trojnásobku částky Provizí; d) další smluvní pokuta ve výši 1.000,00 EUR (jeden tisíc/00 eur) za každé Vozidlo dotčené Závaznou dohodou, která byla následně zrušena; e) Poplatky za již poskytnuté Služby a jakákoli další částka vzniklá ze samostatného právního důvodu podle těchto Všeobecných obchodních podmínek. V rámci Dealer Sales, jelikož Kupující Provize stanovené pro Komisní prodej nedluží, se smluvní pokuta podle písm. c) nepoužije; dlužné naproti tomu zůstávají částky podle písm. b), d) a e). Jsou-li splněny předpoklady stanovené v čl. 13, zůstává dále nedotčena přeměna Zálohové platby ve smluvní pokutu podle čl. 13.6. Částky stanovené tímto odstavcem jsou dlužné z odlišných právních důvodů a lze je kumulovat v mezích povolených zákonem. Případně složená Kauce představuje výlučně zajištění závazků Kupujícího a lze ji započíst na dlužné částky podle čl. 6.3, aniž by představovala další právní titul k účtování částek. Nedotčeno zůstává právo společnosti Fleequid na náhradu další škody, a to pouze v části přesahující to, co již bylo uspokojeno smluvními pokutami stanovenými těmito Všeobecnými obchodními podmínkami. Je-li součet smluvních pokut podle písm. b), pouze pokud jde o denní smluvní pokutu, c) a d), jakož i, připadá-li to v úvahu, smluvní pokuty vyplývající z přeměny Zálohové platby podle čl. 13.6 nižší než 5 % Prodejní ceny pro Kupujícího u Vozidla, které je předmětem zrušeného prodeje, doplní se celkově dlužná složka smluvních pokut výlučně do dosažení této hranice, která působí jako ekonomická spodní mez, a nikoli jako další kumulativní sankce. Pro účely srovnání a doplnění podle předchozí věty: (i) základem výpočtu je výlučně Prodejní cena pro Kupujícího u Vozidla, které je předmětem zrušeného prodeje, s vyloučením Celkové dlužné částky, Provizí, Poplatků a jakékoli jiné vedlejší částky; (ii) rozhodné jsou výlučně výše uvedené smluvní pokuty vlastní porušení povinnosti Kupujícím; (iii) nepřihlíží se k Provizím k tíži Kupujícího, Poplatkům, úrokům z prodlení, zadržené nebo započtené Kauci, náhradám nákladů a výdajů ani k náhradě další škody. Toto ustanovení se použije na všechny Prodejní modely; v rámci Dealer Sales se srovnání provádí pouze se smluvními pokutami tam použitelnými, aniž by smluvní pokuta podle písm. c) mohla být zavedena nebo započítána.</w:t>
       </w:r>
     </w:p>
     <w:p>
@@ -9228,7 +9228,7 @@
           <w:sz w:val="20"/>
           <w:szCs w:val="20"/>
         </w:rPr>
-        <w:t>Odložený prodej: zálohová platba a Vozidlo dočasně v užívání Prodávajícího.</w:t>
+        <w:t>Odložený prodej: Zálohová platba a Vozidlo dočasně v užívání Prodávajícího.</w:t>
       </w:r>
       <w:bookmarkEnd w:id="83"/>
       <w:bookmarkEnd w:id="84"/>
@@ -9303,7 +9303,7 @@
           <w:sz w:val="20"/>
           <w:szCs w:val="20"/>
         </w:rPr>
-        <w:t>U transakcí, u nichž je výslovně sjednáno, že Vozidlo zůstane po uzavření Závazné dohody dočasně v užívání Prodávajícího, může společnost Fleequid požadovat od Kupujícího úhradu částky ve výši 30 % Celkové dlužné částky předem („Zálohová platba“). Případ upravený tímto článkem se výlučně pro popisné a obchodní účely označuje jako „Odložený prodej“. Odložený prodej nepředstavuje samostatný Prodejní model a v plném rozsahu se řídí Prodejním modelem použitelným na konkrétní transakci a, v rámci Komisního prodeje, příslušným způsobem provedení. Odložený prodej lze sjednat výlučně u Komisního prodeje provedeného formou Dalšího prodeje a u Dealer Sales a nepoužije se, působí-li společnost Fleequid jako Čistý zprostředkovatel; transakce Komisního prodeje, na které se použije tento článek, proto společnost Fleequid provádí formou Dalšího prodeje. S okolností, že Vozidlo zůstane dočasně v užívání Prodávajícího, a s konkrétními podmínkami použitelnými na transakci musí být Nabízejícímu umožněno seznámit se před podáním Nabídky v souladu s čl. 3.2 a 4.5. Je-li Zálohová platba požadována, musí být uhrazena v řádné Lhůtě splatnosti podle čl. 11.5, která počíná běžet zpřístupněním Proformy, ledaže Zvláštní prodejní podmínky výslovně stanoví jinou lhůtu podle čl. 11.6 písm. b). Tato úprava se použije výlučně na uvedený případ a představuje odchylku od běžné úpravy Lhůty splatnosti v mezích stanovených tímto článkem a použitelnými Zvláštními prodejními podmínkami.</w:t>
+        <w:t>U transakcí, u nichž je výslovně sjednáno, že Vozidlo zůstane po uzavření Závazné dohody dočasně v užívání Prodávajícího, může společnost Fleequid požadovat od Kupujícího úhradu částky ve výši 30 % Celkové dlužné částky předem („Zálohová platba“). Případ upravený tímto článkem se výlučně pro popisné a obchodní účely označuje jako „Odložený prodej“. Odložený prodej nepředstavuje samostatný Prodejní model a v plném rozsahu se řídí Prodejním modelem použitelným na konkrétní transakci a, v rámci Komisního prodeje, příslušným způsobem provedení. Odložený prodej lze sjednat výlučně u Komisního prodeje provedeného formou Dalšího prodeje a u Dealer Sales a nepoužije se, působí-li společnost Fleequid jako Čistý zprostředkovatel; transakce Komisního prodeje, na které se použije tento článek, proto společnost Fleequid provádí formou Dalšího prodeje. S okolností, že Vozidlo zůstane dočasně v užívání Prodávajícího, a se Zvláštními prodejními podmínkami použitelnými na transakci musí být Nabízejícímu umožněno seznámit se před podáním Nabídky v souladu s čl. 3.2 a 4.5. Je-li Zálohová platba požadována, musí být uhrazena v řádné Lhůtě splatnosti podle čl. 11.5, která počíná běžet zpřístupněním Proformy, ledaže Zvláštní prodejní podmínky výslovně stanoví jinou lhůtu podle čl. 11.6 písm. b). Tato úprava se použije výlučně na uvedený případ a představuje odchylku od běžné úpravy Lhůty splatnosti v mezích stanovených tímto článkem a použitelnými Zvláštními prodejními podmínkami.</w:t>
       </w:r>
     </w:p>
     <w:p>
@@ -9403,7 +9403,7 @@
           <w:sz w:val="20"/>
           <w:szCs w:val="20"/>
         </w:rPr>
-        <w:t>Neuhrazení Zálohové platby v příslušné lhůtě nebo neuhrazení doplatku v plné výši v termínu stanoveném pro konkrétní transakci představuje zpoždění Kupujícího. Od prvního dne následujícího po příslušném termínu splatnosti se v rozsahu, v jakém jsou slučitelná, použijí ustanovení čl. 12.6, včetně smluvní pokuty ve výši 150,00 EUR za každý den zpoždění a za každé dotčené Vozidlo, do celkové maximální výše stanovené v čl. 12.6 písm. a), která se uplatní jednotně za každé Vozidlo a za tutéž transakci jak ve vztahu ke zpoždění s úhradou Zálohové platby, tak ve vztahu ke zpoždění s úhradou doplatku, jakož i úroků a dalších částek tam stanovených. V případě neuhrazení Zálohové platby se použijí lhůty a oprávnění stanovené v čl. 12.7. V případě neuhrazení doplatku si společnost Fleequid namísto maximální lhůty stanovené v čl. 12.7 ponechává oprávnění přijmout opožděnou platbu po dobu 4 (čtyř) dnů následujících po termínu stanoveném pro úhradu doplatku, aniž by od uvedeného termínu počala běžet nová lhůta 7 (sedmi) dnů. Po marném uplynutí této lhůty bez úplného zaplacení může společnost Fleequid podle vlastního uvážení opožděnou platbu přesto přijmout, nebo přistoupit ke Zrušení prodeje v souladu s čl. 12.7, s účinky podle čl. 12.8 a 12.9.</w:t>
+        <w:t>Neuhrazení Zálohové platby v příslušné lhůtě nebo neuhrazení doplatku v plné výši v termínu stanoveném pro konkrétní transakci představuje zpoždění Kupujícího. Od prvního dne následujícího po příslušném termínu splatnosti se v rozsahu, v jakém jsou slučitelná, použijí ustanovení čl. 12.6, včetně smluvní pokuty ve výši 150,00 EUR (sto padesát/00 eur) za každý den zpoždění a za každé dotčené Vozidlo, do celkové maximální výše stanovené v čl. 12.6 písm. a), která se uplatní jednotně za každé Vozidlo a za tutéž transakci jak ve vztahu ke zpoždění s úhradou Zálohové platby, tak ve vztahu ke zpoždění s úhradou doplatku, jakož i úroků a dalších částek tam stanovených. V případě neuhrazení Zálohové platby se použijí lhůty a oprávnění stanovené v čl. 12.7. V případě neuhrazení doplatku si společnost Fleequid namísto maximální lhůty stanovené v čl. 12.7 ponechává oprávnění přijmout opožděnou platbu po dobu 4 (čtyř) dnů následujících po termínu stanoveném pro úhradu doplatku, aniž by od uvedeného termínu počala běžet nová lhůta 7 (sedmi) dnů. Po marném uplynutí této lhůty bez úplného zaplacení může společnost Fleequid podle vlastního uvážení opožděnou platbu přesto přijmout, nebo přistoupit ke Zrušení prodeje v souladu s čl. 12.7, s účinky podle čl. 12.8 a 12.9.</w:t>
       </w:r>
     </w:p>
     <w:p>
@@ -9574,7 +9574,7 @@
           <w:sz w:val="20"/>
           <w:szCs w:val="20"/>
         </w:rPr>
-        <w:t>Zrušení prodeje je smluvním institutem, jímž společnost Fleequid v případech stanovených těmito Všeobecnými obchodními podmínkami, Zvláštními podmínkami nebo použitelnými Zvláštními prodejními podmínkami určí, že transakce nebude provedena nebo přestane být prováděna, a to zcela nebo pouze ve vztahu k jednomu nebo více Vozidlům. Zrušení prodeje se nemusí nutně shodovat s prohlášením smlouvy za neplatnou z důvodů neplatnosti ani s odstoupením od smlouvy pro porušení povinnosti: konkrétní právní důvod závisí na jednotlivém případu, který je vyvolává. Je-li Zrušení důsledkem porušení povinnosti, pro které tyto Všeobecné obchodní podmínky stanoví výslovnou rozvazovací doložku, působí jako odstoupení od Smlouvy podle čl. 1456 italského občanského zákoníku a má jeho účinky. V ostatních případech má Zrušení účinky stanovené ustanovením, které je upravuje, a, není-li upraveno jinak, účinky stanovené tímto článkem a čl. 15.</w:t>
+        <w:t>Zrušení prodeje je smluvním institutem, jímž společnost Fleequid v případech stanovených těmito Všeobecnými obchodními podmínkami, použitelnými Zvláštními podmínkami nebo použitelnými Zvláštními prodejními podmínkami určí, že transakce nebude provedena nebo přestane být prováděna, a to zcela nebo pouze ve vztahu k jednomu nebo více Vozidlům. Zrušení prodeje se nemusí nutně shodovat s prohlášením smlouvy za neplatnou z důvodů neplatnosti ani s odstoupením od smlouvy pro porušení povinnosti: konkrétní právní důvod závisí na jednotlivém případu, který je vyvolává. Je-li Zrušení důsledkem porušení povinnosti, pro které tyto Všeobecné obchodní podmínky stanoví výslovnou rozvazovací doložku, působí jako odstoupení od Smlouvy podle čl. 1456 italského občanského zákoníku a má jeho účinky. V ostatních případech má Zrušení účinky stanovené ustanovením, které je upravuje, a, není-li upraveno jinak, účinky stanovené tímto článkem a čl. 15.</w:t>
       </w:r>
     </w:p>
     <w:p>
@@ -10142,7 +10142,7 @@
           <w:sz w:val="20"/>
           <w:szCs w:val="20"/>
         </w:rPr>
-        <w:t>Vlastnictví Vozidla přechází na Kupujícího výlučně úplným splněním platební povinnosti podle čl. 12.2; v případě Aukcí se tento okamžik shoduje s Konečným přiklepnutím. Strany výslovně sjednávají, že převodní účinek vůči Kupujícímu je odložen k tomuto okamžiku, a to bez ohledu na příslušný Prodejní model a zvolený způsob provedení, včetně případů, kdy společnost Fleequid nabyla vlastnictví Vozidla dříve podle čl. 18, a případů, kdy k prodeji dochází přímo mezi Prodávajícím a Kupujícím, působí-li společnost Fleequid jako Čistý zprostředkovatel. Nedotčeny zůstávají formality týkající se evidence, zápisu, registrace nebo přepisu či jiné úkony případně nezbytné podle příslušných právních předpisů. Po obdržení všech dokladů, informací a součinnosti nezbytných podle čl. 16.3 od Prodávajícího provede osoba, která je k tomu podle příslušného Prodejního modelu a zvoleného způsobu provedení povinna, ve lhůtě následujících 10 (deseti) dnů formality nezbytné k evidenci, zápisu, registraci nebo přepisu převodu Vozidla na Kupujícího, ledaže příslušné právní předpisy, povaha transakce nebo Zvláštní podmínky vyžadují jiný sled úkonů nebo jiné lhůty; působí-li společnost Fleequid jako Čistý zprostředkovatel, vztahuje se tato lhůta na Prodávajícího, s výhradou jiné lhůty případně stanovené Zvláštními prodejními podmínkami s ohledem na transakci, zemi, dokumentaci nebo povahu Vozidla. Působí-li společnost Fleequid jako Čistý zprostředkovatel, člení se proto plnění povinností Prodávajícího do dvou po sobě následujících fází: a) ve lhůtě 5 (pěti) dnů stanovené v čl. 16.3 poskytne Prodávající doklady, prohlášení, plné moci a součinnost nezbytné k zahájení formalit, přičemž se v případě zpoždění uplatní smluvní pokuta stanovená týmž čl. 16.3; b) ve lhůtě následujících 10 (deseti) dnů, která počíná běžet okamžikem, kdy jsou k tomu splněny předpoklady, dokončí Prodávající formality převodu; v případě zpoždění přičitatelného Prodávajícímu po uplynutí této lhůty se uplatní tatáž smluvní pokuta ve výši 150,00 EUR (sto padesát/00 eur) za každý den zpoždění a za každé dotčené Vozidlo, a to podle koordinace s čl. 8.11 a 16.9 stanovené v čl. 16.3. Smluvní pokuta týkající se druhé fáze nenabíhá za dny, za které již naběhla smluvní pokuta týkající se první fáze. Kupující bere na vědomí, že převod a provoz Vozidla mohou vyžadovat dokončení formalit týkajících se evidence, zápisu, registrace nebo obdobných úkonů stanovených právními předpisy použitelnými v dotčené zemi a že zpravidla může k převzetí Vozidla dojít teprve po dokončení nezbytných formalit. Výjimečně, z prokázaných provozních důvodů nebo na žádost Kupujícího přijatou společností Fleequid, může společnost Fleequid povolit předčasné převzetí Vozidla před dokončením uvedených formalit. V takovém případě Kupující: (i) odškodní společnost Fleequid, jakož i případné osoby, na které je Vozidlo dosud formálně zapsáno, a zprostí je odpovědnosti za jakýkoli následek správní, daňové, majetkové, sankční nebo jiné povahy vyplývající z držby, užívání nebo provozu Vozidla před dokončením formalit, s výjimkou toho, co je podle kogentních ustanovení přičitatelné osobě, která se závazku k odškodnění a zproštění odpovědnosti dovolává; (ii) zavazuje se učinit vše potřebné a poskytnout veškerou součinnost nezbytnou k tomu, aby formality konečné evidence, přepisu nebo převodu byly dokončeny do 5 (pěti) dnů od předčasného převzetí, nesdělí-li společnost Fleequid výslovně písemně jinou lhůtu; (iii) zavazuje se předat společnosti Fleequid vhodný listinný důkaz o provedení formalit nebo o podání příslušné žádosti do 1 (jednoho) dne ode dne, kdy má k dispozici příslušný doklad nebo potvrzení příslušného orgánu. V případě zpoždění přičitatelného Kupujícímu po uplynutí lhůty uvedené pod písm. b) je Kupující povinen zaplatit společnosti Fleequid smluvní pokutu ve výši 150,00 EUR (sto padesát/00 eur) za každý den zpoždění a za každé dotčené Vozidlo, až do dokončení příslušných úkonů, aniž by tím bylo dotčeno právo na náhradu další škody. Přesáhne-li zpoždění 30 (třicet) dnů, může společnost Fleequid využít další prostředky nápravy stanovené těmito Všeobecnými obchodními podmínkami a zákonem, včetně, je-li to právně a fakticky proveditelné, oprávnění učinit u příslušných orgánů kroky nezbytné k dosažení přepisu Vozidla na povinnou osobu, přičemž příslušné výdaje, zátěže a náklady jdou k tíži této osoby, aniž jsou dotčeny již naběhlé smluvní pokuty. U transakcí, při nichž je využito Řešení financování, se sled úkonů přepisu, fakturace, platby, převodu vlastnictví a dodání může lišit od běžného sledu v souladu s čl. 22 a použitelnými Zvláštními podmínkami, aniž je dotčeno kritérium převodu vlastnictví stanovené tímto odstavcem a aniž je dotčen čl. 22.6; předčasné provedení úkonů týkajících se dokladů nebo přepisu ve prospěch Poskytovatele financování samo o sobě nevede k převodu vlastnictví ani, v případě Aukcí, ke Konečnému přiklepnutí.</w:t>
+        <w:t>Vlastnictví Vozidla přechází na Kupujícího výlučně úplným splněním platební povinnosti podle čl. 12.2; v případě Aukcí se tento okamžik shoduje s Konečným přiklepnutím. Strany výslovně sjednávají, že převodní účinek vůči Kupujícímu je odložen k tomuto okamžiku, a to bez ohledu na příslušný Prodejní model a zvolený způsob provedení, včetně případů, kdy společnost Fleequid nabyla vlastnictví Vozidla dříve podle čl. 18, a případů, kdy k prodeji dochází přímo mezi Prodávajícím a Kupujícím, působí-li společnost Fleequid jako Čistý zprostředkovatel. Nedotčeny zůstávají formality týkající se evidence, zápisu, registrace nebo přepisu či jiné úkony případně nezbytné podle příslušných právních předpisů. Po obdržení všech dokladů, informací a součinnosti nezbytných podle čl. 16.3 od Prodávajícího provede osoba, která je k tomu podle příslušného Prodejního modelu a zvoleného způsobu provedení povinna, ve lhůtě následujících 10 (deseti) dnů formality nezbytné k evidenci, zápisu, registraci nebo přepisu převodu Vozidla na Kupujícího, ledaže příslušné právní předpisy, povaha transakce nebo Zvláštní podmínky vyžadují jiný sled úkonů nebo jiné lhůty; působí-li společnost Fleequid jako Čistý zprostředkovatel, vztahuje se tato lhůta na Prodávajícího, s výhradou jiné lhůty případně stanovené Zvláštními prodejními podmínkami s ohledem na transakci, zemi, dokumentaci nebo povahu Vozidla. Působí-li společnost Fleequid jako Čistý zprostředkovatel, člení se proto plnění povinností Prodávajícího do dvou po sobě následujících fází: a) ve lhůtě 5 (pěti) dnů stanovené v čl. 16.3 poskytne Prodávající doklady, prohlášení, plné moci a součinnost nezbytné k zahájení formalit, přičemž se v případě zpoždění uplatní smluvní pokuta stanovená týmž čl. 16.3; b) ve lhůtě následujících 10 (deseti) dnů, která počíná běžet okamžikem, kdy jsou k tomu splněny předpoklady, dokončí Prodávající formality převodu; v případě zpoždění přičitatelného Prodávajícímu po uplynutí této lhůty se uplatní tatáž smluvní pokuta ve výši 150,00 EUR (sto padesát/00 eur) za každý den zpoždění a za každé dotčené Vozidlo, a to podle koordinace s čl. 8.11 a 16.9 stanovené v čl. 16.3. Smluvní pokuta týkající se druhé fáze nenabíhá za dny, za které již naběhla smluvní pokuta týkající se první fáze. Kupující bere na vědomí, že převod a provoz Vozidla mohou vyžadovat dokončení formalit týkajících se evidence, zápisu, registrace nebo obdobných úkonů stanovených právními předpisy použitelnými v dotčené zemi a že zpravidla může k převzetí Vozidla dojít teprve po dokončení nezbytných formalit. Výjimečně, z prokázaných provozních důvodů nebo na žádost Kupujícího přijatou společností Fleequid, může společnost Fleequid povolit předčasné převzetí Vozidla před dokončením uvedených formalit. V takovém případě Kupující: (i) odškodní společnost Fleequid, jakož i případné osoby, na které je Vozidlo dosud formálně zapsáno, a zprostí je odpovědnosti za jakýkoli následek správní, daňové, majetkové, sankční nebo jiné povahy vyplývající z držby, užívání nebo provozu Vozidla před dokončením formalit, s výjimkou toho, co je podle kogentních ustanovení přičitatelné osobě, která se závazku k odškodnění a zproštění odpovědnosti dovolává; (ii) zavazuje se učinit vše potřebné a poskytnout veškerou součinnost nezbytnou k tomu, aby formality konečné evidence, přepisu nebo převodu byly dokončeny do 5 (pěti) dnů od předčasného převzetí, nesdělí-li společnost Fleequid výslovně písemně jinou lhůtu; (iii) zavazuje se předat společnosti Fleequid vhodný listinný důkaz o provedení formalit nebo o podání příslušné žádosti do 1 (jednoho) dne ode dne, kdy má k dispozici příslušný doklad nebo potvrzení příslušného orgánu. V případě zpoždění přičitatelného Kupujícímu po uplynutí lhůty uvedené v bodě (ii) je Kupující povinen zaplatit společnosti Fleequid smluvní pokutu ve výši 150,00 EUR (sto padesát/00 eur) za každý den zpoždění a za každé dotčené Vozidlo, až do dokončení příslušných úkonů, aniž by tím bylo dotčeno právo na náhradu další škody. Přesáhne-li zpoždění 30 (třicet) dnů, může společnost Fleequid využít další prostředky nápravy stanovené těmito Všeobecnými obchodními podmínkami a zákonem, včetně, je-li to právně a fakticky proveditelné, oprávnění učinit u příslušných orgánů kroky nezbytné k dosažení přepisu Vozidla na povinnou osobu, přičemž příslušné výdaje, zátěže a náklady jdou k tíži této osoby, aniž jsou dotčeny již naběhlé smluvní pokuty. U transakcí, při nichž je využito Řešení financování, se sled úkonů přepisu, fakturace, platby, převodu vlastnictví a dodání může lišit od běžného sledu v souladu s čl. 22 a použitelnými Zvláštními podmínkami, aniž je dotčeno kritérium převodu vlastnictví stanovené tímto odstavcem a aniž je dotčen čl. 22.6; předčasné provedení úkonů týkajících se dokladů nebo přepisu ve prospěch Poskytovatele financování samo o sobě nevede k převodu vlastnictví ani, v případě Aukcí, ke Konečnému přiklepnutí.</w:t>
       </w:r>
     </w:p>
     <w:p>
@@ -10470,7 +10470,7 @@
           <w:sz w:val="20"/>
           <w:szCs w:val="20"/>
         </w:rPr>
-        <w:t>Ustanovení tohoto článku se použijí na transakce strukturované podle Prodejního modelu Komisního prodeje. V rámci tohoto Prodejního modelu provádí společnost Fleequid transakci formou Dalšího prodeje podle čl. 2.5, anebo může rozhodnout, že bude působit jako Čistý zprostředkovatel podle čl. 2.6, s převodem Vozidla přímo z Prodávajícího na Kupujícího. S možností, že transakce bude provedena jedním, nebo druhým způsobem, je umožněno seznámit se a tato možnost je přijata před podáním Nabídky podle čl. 3.2 písm. a). Společnost Fleequid může příslušnou volbu učinit i po uzavření Závazné dohody, nejpozději však do zpřístupnění Proformy, která s konečnou platností zachycuje zvolený způsob provedení podle čl. 11.4; Proforma není smluvním pramenem této volby, nýbrž dokládá výkon oprávnění, s nímž bylo předem umožněno seznámit se a které bylo předem přijato. Volba mezi Dalším prodejem a působením v postavení Čistého zprostředkovatele nemění Prodejní model, nevede k zániku pověření uděleného společnosti Fleequid Prodávajícím a Kupujícím a nemá vliv na právo společnosti Fleequid na Provize, které jí dluží oba. Kvalifikace společnosti Fleequid jako komisionáře jednajícího vlastním jménem podle čl. 1731 italského občanského zákoníku se uplatní výlučně při Dalším prodeji podle čl. 2.5; působí-li společnost Fleequid jako Čistý zprostředkovatel, je kupní smlouva uzavřena přímo mezi Prodávajícím a Kupujícím podle čl. 2.6 a 17.10. Není-li na ně výslovně odkázáno nebo nejsou-li slučitelná s povahou konkrétního ustanovení, nepoužijí se ustanovení tohoto článku na Dealer Sales, jehož úprava je obsažena v čl. 18. Dopustí-li se Prodávající před zpřístupněním Proformy některého z porušení uvedených pod písm. c), d), e) a f) čl. 17.8 a 17.14, na které se pro tentýž skutek a na ochranu téhož zájmu nevztahuje zvláštní smluvní pokuta stanovená těmito Všeobecnými obchodními podmínkami, je Prodávající povinen zaplatit společnosti Fleequid, s ohledem na vztah týkající se nabízení Vozidla k prodeji podle čl. 8.8 a na pověření udělené společnosti Fleequid a bez ohledu na následně zvolený způsob provedení, zbytkovou smluvní pokutu ve výši 30 % určenou podle pořadí základů stanoveného v čl. 17.8, aniž by tím bylo dotčeno právo na náhradu další škody; od zpřístupnění Proformy se podle zvoleného způsobu provedení použije čl. 17.8, nebo čl. 17.14.</w:t>
+        <w:t>Ustanovení tohoto článku se použijí na transakce strukturované podle Prodejního modelu Komisního prodeje. V rámci tohoto Prodejního modelu provádí společnost Fleequid transakci formou Dalšího prodeje podle čl. 2.5, anebo může rozhodnout, že bude působit jako Čistý zprostředkovatel podle čl. 2.6, s převodem Vozidla přímo z Prodávajícího na Kupujícího. S možností, že transakce bude provedena jedním, nebo druhým způsobem, je umožněno seznámit se před podáním Nabídky podle čl. 3.2 písm. a) a tato možnost je přijata přistoupením k těmto VOP. Společnost Fleequid může příslušnou volbu učinit i po uzavření Závazné dohody, nejpozději však do zpřístupnění Proformy, která s konečnou platností zachycuje zvolený způsob provedení podle čl. 11.4; Proforma není smluvním pramenem této volby, nýbrž dokládá výkon oprávnění, s nímž bylo předem umožněno seznámit se a které bylo předem přijato. Volba mezi Dalším prodejem a působením v postavení Čistého zprostředkovatele nemění Prodejní model, nevede k zániku pověření uděleného společnosti Fleequid Prodávajícím a Kupujícím a nemá vliv na právo společnosti Fleequid na Provize, které jí dluží oba. Kvalifikace společnosti Fleequid jako komisionáře jednajícího vlastním jménem podle čl. 1731 italského občanského zákoníku se uplatní výlučně při Dalším prodeji podle čl. 2.5; působí-li společnost Fleequid jako Čistý zprostředkovatel, je kupní smlouva uzavřena přímo mezi Prodávajícím a Kupujícím podle čl. 2.6 a 17.10. Není-li na ně výslovně odkázáno nebo nejsou-li slučitelná s povahou konkrétního ustanovení, nepoužijí se ustanovení tohoto článku na Dealer Sales, jehož úprava je obsažena v čl. 18. Dopustí-li se Prodávající před zpřístupněním Proformy některého z porušení uvedených pod písm. c), d), e) a f) čl. 17.8 a 17.14, na které se pro tentýž skutek a na ochranu téhož zájmu nevztahuje zvláštní smluvní pokuta stanovená těmito Všeobecnými obchodními podmínkami, je Prodávající povinen zaplatit společnosti Fleequid, s ohledem na vztah týkající se nabízení Vozidla k prodeji podle čl. 8.8 a na pověření udělené společnosti Fleequid a bez ohledu na následně zvolený způsob provedení, zbytkovou smluvní pokutu ve výši 30 % určenou podle pořadí základů stanoveného v čl. 17.8, aniž by tím bylo dotčeno právo na náhradu další škody; od zpřístupnění Proformy se podle zvoleného způsobu provedení použije čl. 17.8, nebo čl. 17.14.</w:t>
       </w:r>
       <w:bookmarkEnd w:id="137"/>
     </w:p>
@@ -10592,32 +10592,32 @@
           <w:sz w:val="20"/>
           <w:szCs w:val="20"/>
         </w:rPr>
-        <w:t>Cena Vozidla, kterou společnost Fleequid dluží Prodávajícímu při Dalším prodeji („Čistá nákupní cena“), odpovídá Prodejní ceně pro Kupujícího po odečtení Provizí k tíži Prodávajícího, Poplatků a jakékoli další částky, kterou Prodávající dluží společnosti Fleequid podle těchto Všeobecných obchodních podmínek. Prodávající výslovně zmocňuje společnost Fleequid k započtení uvedených částek proti částkám, které mu náležejí, a k jejich odečtení z těchto částek. Čistá nákupní cena se stává splatnou výlučně poté, co společnost Fleequid obdržela od Kupujícího Celkovou dlužnou částku v plné výši podle čl. 12.2; do tohoto okamžiku nemůže Prodávající vůči společnosti Fleequid uplatňovat žádnou splatnou pohledávku ani vůči ní podávat žaloby na zaplacení, zasílat jí upomínky nebo zahajovat exekuční řízení. Žádost o vystavení faktury a její případné předčasné vystavení mají administrativní povahu a nezpůsobují splatnost úplaty před uvedeným okamžikem ani nepředstavují potvrzení splnění předpokladů stanovených pro koupi Vozidla společností Fleequid. Dosažení Rezervační ceny, jelikož je určena na základě MZPC stanovené Prodávajícím, zajišťuje Prodávajícímu čistý výnos alespoň ve výši MZPC, ledaže výslovně přijal nižší nabídky podle čl. 10.3. Je-li prodej zrušen nebo jeho předmět zúžen podle čl. 14, stanoví se Čistá nákupní cena dlužná Prodávajícímu nově podle kritérií stanovených v čl. 14.5. Nedotčena zůstává výslovná odchylka stanovená v čl. 22.9 pro transakce, při nichž je využito Řešení financování. Ustanovení tohoto odstavce se nepoužijí, působí-li společnost Fleequid jako Čistý zprostředkovatel.</w:t>
-      </w:r>
-    </w:p>
-    <w:p>
-      <w:pPr>
-        <w:pStyle w:val="Paragrafoelenco"/>
-        <w:numPr>
-          <w:ilvl w:val="1"/>
-          <w:numId w:val="1"/>
-        </w:numPr>
-        <w:spacing w:line="360" w:lineRule="auto"/>
-        <w:ind w:left="0" w:firstLine="0"/>
-        <w:jc w:val="both"/>
-        <w:rPr>
-          <w:rFonts w:ascii="Verdana" w:hAnsi="Verdana"/>
-          <w:sz w:val="20"/>
-          <w:szCs w:val="20"/>
-        </w:rPr>
-      </w:pPr>
-      <w:r>
-        <w:rPr>
-          <w:rFonts w:ascii="Verdana" w:hAnsi="Verdana"/>
-          <w:sz w:val="20"/>
-          <w:szCs w:val="20"/>
-        </w:rPr>
-        <w:t>Postupuje-li společnost Fleequid formou Dalšího prodeje, je Prodávající povinen na žádost společnosti Fleequid vystavit jí fakturu za prodej Vozidla do 5 (pěti) dnů od žádosti, v eurech a v souladu s částkami, údaji a pokyny sdělenými společností Fleequid. Faktura uvádí Prodejní cenu pro Kupujícího, jakož i Provize, Poplatky a případné náhrady výdajů dlužné společnosti Fleequid, vedle DPH, je-li podle zákona splatná; po započtení toho, co je dlužno podle čl. 17.4, uhradí společnost Fleequid fakturu Prodávajícímu, jakmile se Čistá nákupní cena stane splatnou podle téhož čl. 17.4. V případě zpoždění s vystavením nebo předáním faktury po uvedené lhůtě přičitatelného Prodávajícímu je Prodávající povinen zaplatit společnosti Fleequid smluvní pokutu ve výši 150,00 EUR (sto padesát/00 eur) za každý den zpoždění a za každé dotčené Vozidlo, a to až do splnění povinnosti; tuto smluvní pokutu je společnost Fleequid oprávněna započíst proti částce faktury, aniž by tím bylo dotčeno právo na náhradu další škody. Je-li v důsledku nezaplacení ze strany Kupujícího, Zrušení prodeje, zúžení jeho předmětu, opravy transakce nebo z jiného důvodu stanoveného těmito Všeobecnými obchodními podmínkami nutné vystavit dobropis, stornovací nebo opravný doklad anebo fakturu vystavit znovu, a to i v důsledku nového prodeje Vozidla jinému Nabízejícímu za odlišnou částku, je Prodávající povinen tak učinit do 5 (pěti) dnů od žádosti společnosti Fleequid; v případě zpoždění přičitatelného Prodávajícímu se uplatní táž denní smluvní pokuta, kterou je společnost Fleequid oprávněna započíst nebo odečíst od pozdějších částek, které Prodávajícímu náležejí. Nedotčena zůstávají ustanovení čl. 15 a 16.2 o vrácení plnění, daňových dokladech a dalších úkonech nezbytných k provedení transakce nebo k obnovení původního stavu.</w:t>
+        <w:t>Cena Vozidla, kterou společnost Fleequid dluží Prodávajícímu při Dalším prodeji („Čistá nákupní cena“), odpovídá Prodejní ceně pro Kupujícího po odečtení Provizí k tíži Prodávajícího, Poplatků a jakékoli další částky, kterou Prodávající dluží společnosti Fleequid podle těchto Všeobecných obchodních podmínek. Prodávající výslovně zmocňuje společnost Fleequid k započtení uvedených částek proti částkám, které mu náležejí, a k jejich odečtení z těchto částek. Čistá nákupní cena se stává splatnou výlučně poté, co společnost Fleequid obdržela od Kupujícího Celkovou dlužnou částku v plné výši podle čl. 12.2; do tohoto okamžiku nemůže Prodávající vůči společnosti Fleequid uplatňovat žádnou splatnou pohledávku ani vůči ní podávat žaloby na zaplacení, zasílat jí upomínky nebo zahajovat exekuční řízení. Žádost o vystavení faktury a její případné předčasné vystavení mají administrativní povahu a nezpůsobují splatnost úplaty před uvedeným okamžikem ani nepředstavují potvrzení splnění předpokladů stanovených pro koupi Vozidla společností Fleequid. Dosažení Rezervační ceny, jelikož je určena na základě MZPC stanovené Prodávajícím, zajišťuje Prodávajícímu čistý výnos alespoň ve výši MZPC, ledaže výslovně přijal nižší Nabídky podle čl. 10.3. Je-li prodej zrušen nebo jeho předmět zúžen podle čl. 14, stanoví se Čistá nákupní cena dlužná Prodávajícímu nově podle kritérií stanovených v čl. 14.5. Nedotčena zůstává výslovná odchylka stanovená v čl. 22.9 pro transakce, při nichž je využito Řešení financování. Ustanovení tohoto odstavce se nepoužijí, působí-li společnost Fleequid jako Čistý zprostředkovatel.</w:t>
+      </w:r>
+    </w:p>
+    <w:p>
+      <w:pPr>
+        <w:pStyle w:val="Paragrafoelenco"/>
+        <w:numPr>
+          <w:ilvl w:val="1"/>
+          <w:numId w:val="1"/>
+        </w:numPr>
+        <w:spacing w:line="360" w:lineRule="auto"/>
+        <w:ind w:left="0" w:firstLine="0"/>
+        <w:jc w:val="both"/>
+        <w:rPr>
+          <w:rFonts w:ascii="Verdana" w:hAnsi="Verdana"/>
+          <w:sz w:val="20"/>
+          <w:szCs w:val="20"/>
+        </w:rPr>
+      </w:pPr>
+      <w:r>
+        <w:rPr>
+          <w:rFonts w:ascii="Verdana" w:hAnsi="Verdana"/>
+          <w:sz w:val="20"/>
+          <w:szCs w:val="20"/>
+        </w:rPr>
+        <w:t>Postupuje-li společnost Fleequid formou Dalšího prodeje, je Prodávající povinen na žádost společnosti Fleequid vystavit jí fakturu za prodej Vozidla do 5 (pěti) dnů od žádosti, v eurech a v souladu s částkami, údaji a pokyny sdělenými společností Fleequid. Faktura uvádí Prodejní cenu pro Kupujícího, jakož i Provize, Poplatky a případné náhrady výdajů dlužné společnosti Fleequid, vedle DPH, je-li podle zákona splatná; po započtení toho, co je dlužno podle čl. 17.4, uhradí společnost Fleequid fakturu Prodávajícímu, jakmile se Čistá nákupní cena stane splatnou podle téhož čl. 17.4. V případě zpoždění s vystavením nebo předáním faktury po uvedené lhůtě je Prodávající povinen zaplatit společnosti Fleequid smluvní pokutu ve výši 150,00 EUR (sto padesát/00 eur) za každý den zpoždění a za každé dotčené Vozidlo, a to až do splnění povinnosti; tuto smluvní pokutu je společnost Fleequid oprávněna započíst proti částce faktury, aniž by tím bylo dotčeno právo na náhradu další škody. Je-li v důsledku nezaplacení ze strany Kupujícího, Zrušení prodeje, zúžení jeho předmětu, opravy transakce nebo z jiného důvodu stanoveného těmito Všeobecnými obchodními podmínkami nutné vystavit dobropis, stornovací nebo opravný doklad anebo fakturu vystavit znovu, a to i v důsledku nového prodeje Vozidla jinému Nabízejícímu za odlišnou částku, je Prodávající povinen tak učinit do 5 (pěti) dnů od žádosti společnosti Fleequid; v případě zpoždění přičitatelného Prodávajícímu se uplatní táž denní smluvní pokuta, kterou je společnost Fleequid oprávněna započíst nebo odečíst od pozdějších částek, které Prodávajícímu náležejí. Nedotčena zůstávají ustanovení čl. 15 a 16.2 o vrácení plnění, daňových dokladech a dalších úkonech nezbytných k provedení transakce nebo k obnovení původního stavu.</w:t>
       </w:r>
     </w:p>
     <w:p>
@@ -10692,7 +10692,7 @@
           <w:sz w:val="20"/>
           <w:szCs w:val="20"/>
         </w:rPr>
-        <w:t>Společnost Fleequid má právo zcela nebo zčásti odstoupit podle čl. 1456 italského občanského zákoníku od smluvního vztahu týkajícího se koupě Vozidla od Prodávajícího, a to písemným oznámením, jímž prohlásí, že hodlá využít tuto výslovnou rozvazovací doložku, a přistoupit ke Zrušení prodeje podle čl. 14, pokud Prodávající: a) zřídil nebo umožnil zřídit k Vozidlu další Břemena nad rámec těch, která uvedl, anebo nezajistil jejich odstranění ve lhůtách stanovených v čl. 8.3; b) není schopen zajistit volný převod Vozidla, protože čistý výtěžek, který mu náleží, nepostačuje k uspokojení věřitelů oprávněných k uvolnění věci a k úhradě dalších částek dlužných v souvislosti s transakcí, anebo protože osoby oprávněné z Břemen odmítnou uvolnění nebo volný prodej; c) poskytl při registraci, při podání Návrhu prodeje nebo později nepravdivé, nepřesné, podvodné, neaktuální nebo neúplné informace či dokumenty významné pro konkrétní transakci; d) poruší povinnosti stanovené těmito Všeobecnými obchodními podmínkami v oblasti vlastnictví, dostupnosti, opatrování a uchování Vozidla, pravdivosti informací, dokumentace, exkluzivity, převodu vlastnictví, dodání, právních předpisů v oblasti životního prostředí nebo práv třetích osob; e) poruší kogentní normy nebo správní předpisy použitelné na nabízení Vozidla k prodeji, jeho převod nebo správu, anebo práva třetích osob, a to tak, že tím ohrozí pokračování transakce nebo je učiní rizikovým; f) odmítne nebo opomene převést vlastnictví Vozidla anebo učinit úkony, splnit formality či poskytnout součinnost nezbytné k evidenci nebo přepisu Vozidla na společnost Fleequid, anebo nesplní povinnost poskytnout je k dispozici nebo je dodat v souladu s těmito Všeobecnými obchodními podmínkami. Nedotčeno dále zůstává oprávnění společnosti Fleequid pozastavit transakci nebo nabízení Vozidla k prodeji a přijmout přiměřeně nezbytná opatření, je-li to vhodné k předcházení podvodům, k ochraně bezpečnosti Online tržiště, společnosti Fleequid, Kupujícího nebo třetích osob, k prověření rizikových situací, k provedení šetření nebo k zajištění dodržování příslušných právních předpisů, včetně předpisů v oblasti životního prostředí; přijetí těchto opatření má zajišťovací povahu a samo o sobě neznamená využití výslovné rozvazovací doložky ani uplatnění smluvní pokuty stanovené tímto odstavcem, které předpokládají zjištění porušení smlouvy nebo právních předpisů přičitatelného Prodávajícímu. V případě odstoupení od smlouvy nebo Zrušení z některého z důvodů stanovených tímto odstavcem zůstávají dlužné Provize k tíži Prodávajícího, na něž případně již vznikl nárok podle čl. 12.4, Poplatky, náklady a výdaje vynaložené společností Fleequid v souvislosti s transakcí a další částky, na něž vznikl nárok ze samostatného právního důvodu. V případech uvedených pod písm. c), d), e) a f), ledaže se na tentýž skutek již na ochranu téhož zájmu vztahuje zvláštní smluvní pokuta stanovená těmito Všeobecnými obchodními podmínkami, včetně, příkladmo, smluvních pokut podle čl. 8.9, 8.11, 8.12 a 16.9, je Prodávající dále povinen zaplatit společnosti Fleequid z titulu smluvní pokuty částku ve výši 30 % Rezervační ceny určené u příležitosti první Aukce týkající se Vozidla, přičemž případná pozdější snížení Rezervační ceny nejsou rozhodná, anebo, nekonala-li se ohledně Vozidla žádná Aukce s Rezervační cenou, avšak byla-li pro konkrétní transakci stanovena Rezervační cena, ve výši 30 % této Rezervační ceny, anebo dále, nebyla-li pro konkrétní transakci stanovena žádná Rezervační cena, ve výši 30 % Prodejní ceny pro Kupujícího, anebo, není-li dána ani Prodejní cena pro Kupujícího, ve výši 30 % MZPC týkající se konkrétní transakce, s výhradou čl. 18.5 ohledně Dealer Sales, aniž by tím bylo dotčeno právo na náhradu další škody. V případech, kdy se podle předchozí věty a čl. 15.8 uplatní zvláštní smluvní pokuta namísto smluvní pokuty stanovené tímto odstavcem, zůstávají nedotčeny oprávnění k odstoupení od smlouvy podle čl. 1456 italského občanského zákoníku a další následky stanovené tímto odstavcem jiné než smluvní pokuta; kumulovat lze naproti tomu následky stanovené za odlišné skutečnosti nebo porušení, a to v souladu s čl. 15.8. Ve vztahu k odmítnutí nebo opomenutí převést vlastnictví Vozidla podle písm. f) se smluvní pokuta stanovená tímto odstavcem za tentýž skutek neuplatní ani předtím, než jsou naplněny předpoklady odmítnutí stanovené v čl. 8.11; jsou-li tyto předpoklady naplněny, uplatní se zvláštní smluvní pokuta stanovená v čl. 8.11, přičemž nedotčeny zůstávají oprávnění k odstoupení od smlouvy podle čl. 1456 italského občanského zákoníku a další následky stanovené tímto odstavcem jiné než smluvní pokuta.</w:t>
+        <w:t>Společnost Fleequid má právo zcela nebo zčásti odstoupit podle čl. 1456 italského občanského zákoníku od smluvního vztahu týkajícího se koupě Vozidla od Prodávajícího, a to písemným oznámením, jímž prohlásí, že hodlá využít tuto výslovnou rozvazovací doložku, a přistoupit ke Zrušení prodeje podle čl. 14, pokud Prodávající: a) zřídil nebo umožnil zřídit k Vozidlu další Břemena nad rámec těch, která uvedl, anebo nezajistil jejich odstranění ve lhůtách stanovených v čl. 8.3; b) není schopen zajistit volný převod Vozidla, protože čistý výtěžek, který mu náleží, nepostačuje k uspokojení věřitelů oprávněných k uvolnění věci a k úhradě dalších částek dlužných v souvislosti s transakcí, anebo protože osoby oprávněné z Břemen odmítnou uvolnění nebo volný prodej; c) poskytl při registraci, při podání Návrhu prodeje nebo později nepravdivé, nepřesné, podvodné, neaktuální nebo neúplné informace či dokumenty významné pro konkrétní transakci; d) poruší povinnosti stanovené těmito Všeobecnými obchodními podmínkami v oblasti vlastnictví, dostupnosti, opatrování a uchování Vozidla, pravdivosti informací, dokumentace, exkluzivity, převodu vlastnictví, dodání, právních předpisů v oblasti životního prostředí nebo práv třetích osob; e) poruší kogentní normy nebo správní předpisy použitelné na nabízení Vozidla k prodeji, jeho převod nebo správu, anebo práva třetích osob, a to tak, že tím ohrozí pokračování transakce nebo je učiní rizikovým; f) odmítne nebo opomene převést vlastnictví Vozidla anebo učinit úkony, splnit formality či poskytnout součinnost nezbytné k evidenci nebo přepisu Vozidla na společnost Fleequid, anebo nesplní povinnost poskytnout je k dispozici nebo je dodat v souladu s těmito Všeobecnými obchodními podmínkami. Nedotčeno dále zůstává oprávnění společnosti Fleequid pozastavit transakci nebo nabízení Vozidla k prodeji a přijmout přiměřeně nezbytná opatření, je-li to vhodné k předcházení podvodům, k ochraně bezpečnosti Online tržiště, společnosti Fleequid, Kupujícího nebo třetích osob, k prověření rizikových situací, k provedení šetření nebo k zajištění dodržování příslušných právních předpisů, včetně předpisů v oblasti životního prostředí; přijetí těchto opatření má zajišťovací povahu a samo o sobě neznamená využití výslovné rozvazovací doložky ani uplatnění smluvní pokuty stanovené tímto odstavcem, které předpokládají zjištění porušení smlouvy nebo právních předpisů přičitatelného Prodávajícímu. V případě odstoupení od smlouvy nebo Zrušení z některého z důvodů stanovených tímto odstavcem zůstávají dlužné Provize k tíži Prodávajícího, na něž případně již vznikl nárok podle čl. 12.4, Poplatky, náklady a výdaje vynaložené společností Fleequid v souvislosti s transakcí a další částky, na něž vznikl nárok ze samostatného právního důvodu. V případech uvedených pod písm. c), d), e) a f), ledaže se na tentýž skutek již na ochranu téhož zájmu vztahuje zvláštní smluvní pokuta stanovená těmito Všeobecnými obchodními podmínkami, včetně, příkladmo, smluvních pokut podle čl. 8.9, 8.11, 8.12 a 16.9, je Prodávající dále povinen zaplatit společnosti Fleequid z titulu smluvní pokuty částku ve výši 30 % Rezervační ceny určené u příležitosti první Aukce týkající se Vozidla, přičemž případná pozdější snížení Rezervační ceny nejsou rozhodná, anebo, nekonala-li se ohledně Vozidla žádná Aukce s Rezervační cenou, avšak byla-li pro konkrétní transakci stanovena Rezervační cena, ve výši 30 % této Rezervační ceny, anebo dále, nebyla-li pro konkrétní transakci stanovena žádná Rezervační cena, ve výši 30 % Prodejní ceny pro Kupujícího, anebo, není-li dána ani Prodejní cena pro Kupujícího, ve výši 30 % MZPC týkající se konkrétní transakce, s výhradou čl. 18.5 ohledně Dealer Sales, aniž by tím bylo dotčeno právo na náhradu další škody. V případech, kdy se podle předchozí věty a čl. 15.8 uplatní zvláštní smluvní pokuta namísto smluvní pokuty stanovené tímto odstavcem, zůstávají nedotčeny oprávnění k odstoupení od smlouvy podle čl. 1456 italského občanského zákoníku a další následky stanovené tímto odstavcem jiné než smluvní pokuta; kumulovat lze naproti tomu následky stanovené za odlišné skutečnosti nebo porušení, a to v souladu s čl. 15.8. Ve vztahu k odmítnutí nebo opomenutí převést vlastnictví Vozidla podle písm. f) se smluvní pokuta stanovená tímto odstavcem za tentýž skutek neuplatní ani předtím, než jsou naplněny předpoklady odmítnutí stanovené v čl. 8.11; jsou-li tyto předpoklady naplněny, uplatní se zvláštní smluvní pokuta stanovená v čl. 8.11 písm. a), přičemž nedotčeny zůstávají oprávnění k odstoupení od smlouvy podle čl. 1456 italského občanského zákoníku a další následky stanovené tímto odstavcem jiné než smluvní pokuta.</w:t>
       </w:r>
     </w:p>
     <w:p>
@@ -11047,7 +11047,7 @@
           <w:sz w:val="20"/>
           <w:szCs w:val="20"/>
         </w:rPr>
-        <w:t>V rámci Dealer Sales je Prodávající povinen na žádost společnosti Fleequid vystavit jí fakturu za prodej Vozidla do 5 (pěti) dnů od žádosti, v souladu s údaji a pokyny sdělenými společností Fleequid. Faktura se vystavuje na Nákupní cenu sjednanou podle čl. 18.3, vedle DPH, uplatní-li se, a případných dalších částek vztahujících se výlučně k příslušnému kupnímu vztahu. V případě zpoždění s vystavením nebo předáním faktury přičitatelného Prodávajícímu je Prodávající povinen zaplatit společnosti Fleequid smluvní pokutu ve výši 150,00 EUR (sto padesát/00 eur) za každý den zpoždění a za každé dotčené Vozidlo, a to až do splnění povinnosti, aniž by tím bylo dotčeno právo na náhradu další škody. Je-li nutné vystavit dobropis, stornovací nebo opravný doklad anebo fakturu vystavit znovu, je Prodávající povinen tak učinit do 5 (pěti) dnů od žádosti společnosti Fleequid, přičemž v případě zpoždění se uplatní táž smluvní pokuta. Samostatná a nezávislá zůstává fakturace společnosti Fleequid vůči Kupujícímu, kterou upravuje čl. 16.2.</w:t>
+        <w:t>V rámci Dealer Sales je Prodávající povinen na žádost společnosti Fleequid vystavit jí fakturu za prodej Vozidla do 5 (pěti) dnů od žádosti, v souladu s údaji a pokyny sdělenými společností Fleequid. Faktura se vystavuje na Nákupní cenu sjednanou podle čl. 18.3, vedle DPH, uplatní-li se, a případných dalších částek vztahujících se výlučně k příslušnému kupnímu vztahu. V případě zpoždění s vystavením nebo předáním faktury je Prodávající povinen zaplatit společnosti Fleequid smluvní pokutu ve výši 150,00 EUR (sto padesát/00 eur) za každý den zpoždění a za každé dotčené Vozidlo, a to až do splnění povinnosti, aniž by tím bylo dotčeno právo na náhradu další škody. Je-li nutné vystavit dobropis, stornovací nebo opravný doklad anebo fakturu vystavit znovu, je Prodávající povinen tak učinit do 5 (pěti) dnů od žádosti společnosti Fleequid, přičemž v případě zpoždění se uplatní táž smluvní pokuta. Samostatná a nezávislá zůstává fakturace společnosti Fleequid vůči Kupujícímu, kterou upravuje čl. 16.2.</w:t>
       </w:r>
     </w:p>
     <w:p>
@@ -11075,7 +11075,7 @@
           <w:sz w:val="20"/>
           <w:szCs w:val="20"/>
         </w:rPr>
-        <w:t>Ve vztahu koupě mezi Prodávajícím a společností Fleequid zůstávají v plném rozsahu nedotčena prohlášení, záruky a závazky k odškodnění a zproštění odpovědnosti, k náhradě nákladů a k regresu uložené Prodávajícímu těmito Všeobecnými obchodními podmínkami, včetně těch, které stanoví čl. 8.3, 8.12, 8.13 a 19.6, jakož i úprava oznámení vad a příslušných lhůt podle čl. 17.7 a výslovná rozvazovací doložka a ekonomické následky podle čl. 17.8, které se použijí na kupní smlouvu uzavřenou společností Fleequid v rámci Dealer Sales; pro účely určení smluvní pokuty stanovené v čl. 17.8 platí, že neexistuje-li u Vozidla ani Rezervační cena, ani Prodejní cena pro Kupujícího, k čemuž může dojít zejména při nákupu na sklad, tvoří konečný podpůrný základ namísto MZPC Nákupní cena, kterou společnost Fleequid dluží Prodávajícímu. Koupě Vozidla společností Fleequid tuto ochranu neruší ani neomezuje. Závazek k odškodnění a zproštění odpovědnosti podle čl. 8.13 se výslovně vztahuje i na nároky uplatněné Kupujícím vůči společnosti Fleequid jako skutečnému prodávajícímu, jakož i na částky, náklady, opravy, výdaje, zátěže a škody, které společnost Fleequid v tomto postavení nese z důvodu skutečností, vad, závad, opomenutí nebo porušení povinností přičitatelných Prodávajícímu, s právem na regres a na plnou náhradu vůči Prodávajícímu. Vyjde-li neshoda, vada, škoda nebo jiná okolnost přičitatelná Prodávajícímu najevo nebo oznámí-li ji Kupující po přeprodeji Vozidla, zachovává si společnost Fleequid právo uplatnit ji vůči Prodávajícímu ve lhůtách stanovených v čl. 17.7, které, nebyla-li skutečnost společnosti Fleequid známa již dříve, počínají běžet jejím zjištěním nebo obdržením reklamace Kupujícího. Zaplacení Nákupní ceny, převzetí Vozidla společností Fleequid nebo osobami jí pověřenými a následný přeprodej Kupujícímu neznamenají vzdání se práv na odškodnění a zproštění odpovědnosti, na regres, na náhradu nákladů ani dalších prostředků nápravy náležejících společnosti Fleequid vůči Prodávajícímu.</w:t>
+        <w:t>Ve vztahu koupě mezi Prodávajícím a společností Fleequid zůstávají v plném rozsahu nedotčena prohlášení, záruky a závazky k odškodnění a zproštění odpovědnosti, k náhradě nákladů a k regresu uložené Prodávajícímu těmito Všeobecnými obchodními podmínkami, včetně těch, které stanoví čl. 8.3, 8.12, 8.13 a 19.6, jakož i úprava oznámení vad a příslušných lhůt podle čl. 17.7 a výslovná rozvazovací doložka a ekonomické následky podle čl. 17.8, které se použijí na kupní smlouvu uzavřenou společností Fleequid v rámci Dealer Sales; pro účely určení smluvní pokuty stanovené v čl. 17.8 platí, že neexistuje-li u Vozidla ani Rezervační cena, ani Prodejní cena pro Kupujícího, k čemuž může dojít zejména při nákupu na sklad, tvoří konečný podpůrný základ namísto MZPC Nákupní cena, kterou společnost Fleequid dluží Prodávajícímu. Koupě Vozidla společností Fleequid tuto ochranu neruší ani neomezuje. Závazek k odškodnění a zproštění odpovědnosti podle čl. 8.13 se výslovně vztahuje i na nároky uplatněné Kupujícím vůči společnosti Fleequid jako skutečnému prodávajícímu, jakož i na částky, náklady, opravy, výdaje, zátěže a škody, které společnost Fleequid v tomto postavení nese z důvodu skutečností, vad, závad, opomenutí nebo porušení povinností přičitatelných Prodávajícímu, s právem na regres a na plnou náhradu vůči Prodávajícímu. Vyjde-li neshoda, vada, poškození Vozidla nebo jiná okolnost přičitatelná Prodávajícímu najevo nebo oznámí-li ji Kupující po přeprodeji Vozidla, zachovává si společnost Fleequid právo uplatnit ji vůči Prodávajícímu ve lhůtách stanovených v čl. 17.7, které, nebyla-li skutečnost společnosti Fleequid známa již dříve, počínají běžet jejím zjištěním nebo obdržením reklamace Kupujícího. Zaplacení Nákupní ceny, převzetí Vozidla společností Fleequid nebo osobami jí pověřenými a následný přeprodej Kupujícímu neznamenají vzdání se práv na odškodnění a zproštění odpovědnosti, na regres, na náhradu nákladů ani dalších prostředků nápravy náležejících společnosti Fleequid vůči Prodávajícímu.</w:t>
       </w:r>
     </w:p>
     <w:p>
@@ -11479,7 +11479,7 @@
           <w:sz w:val="20"/>
           <w:szCs w:val="20"/>
         </w:rPr>
-        <w:t>Před podáním Nabídky je Kupující povinen s péčí, kterou vyžaduje jeho profesionální postavení, prozkoumat Inzerát, Technické specifikace, TrustReport, je-li k dispozici, fotografie, dokumentaci a veškeré další informace zpřístupněné v souvislosti s Vozidlem a rovněž využít možnosti Vozidlo zhlédnout, podrobit je prohlídce a vyzkoušet, pokud ji společnost Fleequid nebo Prodávající poskytne. Za skryté vady nelze považovat a nároky ze záruky, na slevu z ceny, na odškodnění nebo na náhradu škody nelze zakládat na vadách, závadách, neshodách, provozních podmínkách, opotřebení, nedostatcích shody nebo chybějících položkách – a to i týkajících se částí, které nejsou bezprostředně viditelné nebo snadno přístupné –, které vyplývaly ze zpřístupněných informací nebo dokumentace anebo které Kupující mohl zjistit jejich prozkoumáním nebo využitím případné možnosti prohlídky a vyzkoušení Vozidla. Neprovedení prohlídky nebo zkoušky, které společnost Fleequid vždy nabízí, jde na riziko Kupujícího a nemůže vést k rozšíření použitelného režimu záruky. Povinnost prozkoumání a prohlídky stanovená tímto odstavcem platí ve všech Prodejních modelech a při všech způsobech provedení.</w:t>
+        <w:t>Před podáním Nabídky je Kupující povinen s péčí, kterou vyžaduje jeho profesionální postavení, prozkoumat Inzerát, Technické specifikace, TrustReport, je-li k dispozici, fotografie, dokumentaci a veškeré další informace zpřístupněné v souvislosti s Vozidlem a rovněž využít možnosti Vozidlo zhlédnout, podrobit je prohlídce a vyzkoušet. Za skryté vady nelze považovat a nároky ze záruky, na slevu z ceny, na odškodnění nebo na náhradu škody nelze zakládat na vadách, závadách, neshodách, provozních podmínkách, opotřebení, nedostatcích shody nebo chybějících položkách – a to i týkajících se částí, které nejsou bezprostředně viditelné nebo snadno přístupné –, které vyplývaly ze zpřístupněných informací nebo dokumentace anebo které Kupující mohl zjistit jejich prozkoumáním nebo využitím možnosti prohlídky a vyzkoušení Vozidla. Neprovedení prohlídky nebo zkoušky, které společnost Fleequid vždy nabízí, jde na riziko Kupujícího a nemůže vést k rozšíření použitelného režimu záruky. Povinnost prozkoumání a prohlídky stanovená tímto odstavcem platí ve všech Prodejních modelech a při všech způsobech provedení.</w:t>
       </w:r>
     </w:p>
     <w:p>
@@ -11892,10 +11892,19 @@
       <w:r>
         <w:rPr>
           <w:rFonts w:ascii="Verdana" w:hAnsi="Verdana"/>
-          <w:sz w:val="20"/>
-          <w:szCs w:val="20"/>
-        </w:rPr>
-        <w:t>Komisní prodej, při němž společnost Fleequid působí jako Čistý zprostředkovatel. Působí-li společnost Fleequid podle čl. 2.6, existují kupní smlouva a příslušný záruční vztah přímo a výlučně mezi Prodávajícím a Kupujícím, a to v mezích, s vyloučeními a podle smluvených lhůt stanovených tímto článkem, na jejichž použití i na svůj přímý vztah se Prodávající a Kupující výslovně dohodli. Společnost Fleequid Vozidlo nekupuje, nenabývá postavení prodávajícího a neodpovídá za jeho shodu, jakost, vady nebo závady ani za splnění záručních povinností Prodávajícího. Prodávající a Kupující, každý v rozsahu, který mu přísluší, se zavazují odškodnit společnost Fleequid a zprostit ji odpovědnosti ve vztahu k jakémukoli požadavku, žalobě, námitce, nároku ze záruky, na vrácení plnění, na slevu z ceny, na odškodnění nebo na náhradu škody, jakož i k souvisejícím nákladům a výdajům, týkajícím se Vozidla nebo příslušné kupní smlouvy. Spojovací doložka podle čl. 21 se nepoužije, neboť společnost Fleequid není stranou kupní smlouvy.</w:t>
+          <w:b/>
+          <w:sz w:val="20"/>
+          <w:szCs w:val="20"/>
+        </w:rPr>
+        <w:t>Komisní prodej, při němž společnost Fleequid působí jako Čistý zprostředkovatel</w:t>
+      </w:r>
+      <w:r>
+        <w:rPr>
+          <w:rFonts w:ascii="Verdana" w:hAnsi="Verdana"/>
+          <w:sz w:val="20"/>
+          <w:szCs w:val="20"/>
+        </w:rPr>
+        <w:t>. Působí-li společnost Fleequid podle čl. 2.6, existují kupní smlouva a příslušný záruční vztah přímo a výlučně mezi Prodávajícím a Kupujícím, a to v mezích, s vyloučeními a podle smluvených lhůt stanovených tímto článkem, na jejichž použití i na svůj přímý vztah se Prodávající a Kupující výslovně dohodli. Společnost Fleequid Vozidlo nekupuje, nenabývá postavení prodávajícího a neodpovídá za jeho shodu, jakost, vady nebo závady ani za splnění záručních povinností Prodávajícího. Prodávající a Kupující, každý v rozsahu, který mu přísluší, se zavazují odškodnit společnost Fleequid a zprostit ji odpovědnosti ve vztahu k jakémukoli požadavku, žalobě, námitce, nároku ze záruky, na vrácení plnění, na slevu z ceny, na odškodnění nebo na náhradu škody, jakož i k souvisejícím nákladům a výdajům, týkajícím se Vozidla nebo příslušné kupní smlouvy. Spojovací doložka podle čl. 21 se nepoužije, neboť společnost Fleequid není stranou kupní smlouvy.</w:t>
       </w:r>
     </w:p>
     <w:p>
@@ -11929,7 +11938,7 @@
           <w:sz w:val="20"/>
           <w:szCs w:val="20"/>
         </w:rPr>
-        <w:t>. Při prodejích uzavřených podle Dealer Sales nabývá společnost Fleequid vůči Kupujícímu postavení skutečného prodávajícího, záruka je však výlučně ta, která vyplývá z ujednání mezi Profesionály obsaženého v tomto článku, se všemi vyloučeními, omezeními, předpoklady a prekluzemi v něm stanovenými. Žádnou další záruku, výslovnou ani implicitní, nelze považovat za poskytnutou společností Fleequid, ledaže ji společnost Fleequid v jednotlivé transakci zvlášť písemně převzala. Oznámení vad, závad nebo neshod musí být pod sankcí prekluze učiněno ve lhůtách a způsobem stanovenými v čl. 20.2 a v každém případě do 30 (třiceti) dnů od dodání a za podmínky, že Vozidlo následně neujelo více než 1.000 (tisíc) km, přičemž Strany se výslovně dohodly, že jde o smluvené prekluzivní lhůty ve smyslu čl. 1495 italského občanského zákoníku. Nedotčeno dále zůstává ustanovení čl. 16.12 o zjevných vadách, poškozeních a neshodách zjistitelných v okamžiku dodání. Případná odpovědnost společnosti Fleequid nemůže v žádném případě přesáhnout výslovně sjednaný režim záruky, aniž jsou dotčeny záruky, závazky k odškodnění a zproštění odpovědnosti, povinnosti k náhradě nákladů a práva na regres náležející společnosti Fleequid vůči původnímu Prodávajícímu podle čl. 8.13, 18.5 a 19.6. Na Dealer Sales se nepoužije spojovací doložka podle čl. 21 a příslušnou úpravu nelze použít analogicky.</w:t>
+        <w:t>. Při prodejích uzavřených podle Dealer Sales nabývá společnost Fleequid vůči Kupujícímu postavení skutečného prodávajícího, záruka je však výlučně ta, která vyplývá z ujednání mezi Profesionály obsaženého v tomto článku, se všemi vyloučeními, omezeními, předpoklady a prekluzemi v něm stanovenými. Žádnou další záruku, výslovnou ani implicitní, nelze považovat za poskytnutou společností Fleequid, ledaže ji společnost Fleequid v jednotlivé transakci zvlášť písemně převzala. Oznámení vad, závad nebo neshod musí být pod sankcí prekluze učiněno ve lhůtách a způsobem stanovenými v čl. 20.2 a v každém případě do 30 (třiceti) kalendářních dnů od dodání a za podmínky, že Vozidlo následně neujelo více než 1.000 (tisíc) km, přičemž Strany se výslovně dohodly, že jde o smluvené prekluzivní lhůty ve smyslu čl. 1495 italského občanského zákoníku. Nedotčeno dále zůstává ustanovení čl. 16.12 o zjevných vadách, poškozeních a neshodách zjistitelných v okamžiku dodání. Případná odpovědnost společnosti Fleequid nemůže v žádném případě přesáhnout výslovně sjednaný režim záruky, aniž jsou dotčeny záruky, závazky k odškodnění a zproštění odpovědnosti, povinnosti k náhradě nákladů a práva na regres náležející společnosti Fleequid vůči původnímu Prodávajícímu podle čl. 8.13, 18.5 a 19.6. Na Dealer Sales se nepoužije spojovací doložka podle čl. 21 a příslušnou úpravu nelze použít analogicky.</w:t>
       </w:r>
     </w:p>
     <w:p>
@@ -12101,7 +12110,7 @@
           <w:sz w:val="20"/>
           <w:szCs w:val="20"/>
         </w:rPr>
-        <w:t xml:space="preserve"> nebo jakýmkoli jiným způsobem, který poskytuje důkaz o doručení společnosti Fleequid. Neshody, vady a závady zjistitelné v okamžiku dodání musí být předem oznámeny podle čl. 16.12. Pod sankcí prekluze musí reklamace dojít společnosti Fleequid nejpozději do 30 (třiceti) dnů ode dne dodání a dříve, než Vozidlo ujede dalších 1.000 (tisíc) km. Reklamace musí obsahovat informace a dokumentaci, včetně fotografické, nezbytné k posouzení výtky; společnost Fleequid si může vyžádat další dokumenty nebo vysvětlení, které je Kupující povinen poskytnout do 5 (pěti) dnů od žádosti. Při nedodržení uvedených lhůt nebo požadovaných způsobů může společnost Fleequid reklamaci nevyřizovat a odložit ji a není povinna zohlednit reklamace podané ve lhůtách, způsobem nebo s informacemi odlišnými od stanovených. Lhůty stanovené tímto odstavcem působí jako smluvené prekluzivní lhůty ve všech Prodejních modelech, s výhradou podle čl. 19.8, a aniž jsou ve vztazích mezi společností Fleequid a Prodávajícím dotčeny odlišné lhůty pro oznámení stanovené v čl. 17.7 a 18.5.</w:t>
+        <w:t xml:space="preserve"> nebo jakýmkoli jiným způsobem, který poskytuje důkaz o doručení společnosti Fleequid. Neshody, vady a závady zjistitelné v okamžiku dodání musí být předem oznámeny podle čl. 16.12. Pod sankcí prekluze musí reklamace dojít společnosti Fleequid nejpozději do 30 (třiceti) kalendářních dnů ode dne dodání a dříve, než Vozidlo ujede dalších 1.000 (tisíc) km. Reklamace musí obsahovat informace a dokumentaci, včetně fotografické, nezbytné k posouzení výtky; společnost Fleequid si může vyžádat další dokumenty nebo vysvětlení, které je Kupující povinen poskytnout do 5 (pěti) dnů od žádosti. Při nedodržení uvedených lhůt nebo požadovaných způsobů může společnost Fleequid reklamaci nevyřizovat a odložit ji a není povinna zohlednit reklamace podané ve lhůtách, způsobem nebo s informacemi odlišnými od stanovených. Lhůty stanovené tímto odstavcem působí jako smluvené prekluzivní lhůty ve všech Prodejních modelech, s výhradou podle čl. 19.8, a aniž jsou ve vztazích mezi společností Fleequid a Prodávajícím dotčeny odlišné lhůty pro oznámení stanovené v čl. 17.7 a 18.5.</w:t>
       </w:r>
     </w:p>
     <w:p>
@@ -12595,7 +12604,7 @@
           <w:sz w:val="20"/>
           <w:szCs w:val="20"/>
         </w:rPr>
-        <w:t>Pro účely čl. 12.2 mohou Zvláštní podmínky přiznat neodvolatelnému závazku Poskytovatele financování, který splňuje tam stanovené požadavky, účinek rovnocenný úplnému splnění platební povinnosti a určit okamžik, od něhož tento účinek nastává. Není-li to výslovně stanoveno, jsou rozhodné výlučně platby skutečně obdržené příslušnými příjemci.</w:t>
+        <w:t>Pro účely čl. 12.2 mohou Zvláštní podmínky přiznat neodvolatelnému závazku Poskytovatele financování, který splňuje požadavky stanovené týmiž Zvláštními podmínkami, účinek rovnocenný úplnému splnění platební povinnosti a určit okamžik, od něhož tento účinek nastává. Není-li to výslovně stanoveno, jsou rozhodné výlučně platby skutečně obdržené příslušnými příjemci.</w:t>
       </w:r>
     </w:p>
     <w:p>
@@ -13016,7 +13025,7 @@
           <w:sz w:val="20"/>
           <w:szCs w:val="20"/>
         </w:rPr>
-        <w:t>22077 Olgiate Comasco (CO),</w:t>
+        <w:t>22077 Olgiate Comasco (CO)</w:t>
       </w:r>
     </w:p>
     <w:p>
@@ -13559,7 +13568,7 @@
           <w:sz w:val="20"/>
           <w:szCs w:val="20"/>
         </w:rPr>
-        <w:t>Čl. 13 (Odložený prodej: zálohová platba a Vozidlo dočasně v užívání Prodávajícího)</w:t>
+        <w:t>Čl. 13 (Odložený prodej: Zálohová platba a Vozidlo dočasně v užívání Prodávajícího)</w:t>
       </w:r>
       <w:r>
         <w:rPr>

</xml_diff>